<commit_message>
Document first Xschem simulation workflow
</commit_message>
<xml_diff>
--- a/docs/lecture/IRSX_ASIC_Student_Lab_Handbook_JP.docx
+++ b/docs/lecture/IRSX_ASIC_Student_Lab_Handbook_JP.docx
@@ -8028,6 +8028,508 @@
         <w:rPr>
           <w:rFonts w:ascii="Hiragino Sans" w:hAnsi="Hiragino Sans" w:eastAsia="Hiragino Sans"/>
         </w:rPr>
+        <w:t>2.1 Docker・VNC・/fossの関係</w:t>
+      </w:r>
+    </w:p>
+    <w:p>
+      <w:r>
+        <w:rPr>
+          <w:rFonts w:ascii="Hiragino Sans" w:hAnsi="Hiragino Sans" w:eastAsia="Hiragino Sans"/>
+        </w:rPr>
+        <w:t>VNCで接続している先はDocker Desktopの管理画面ではなく、Docker Desktop上で動くIIC-OSIC-TOOLS Linux containerの仮想desktopです。Browserはlocalhost:8080へ接続し、container内のweb/VNC serverがLinux desktop画面を転送します。</w:t>
+      </w:r>
+    </w:p>
+    <w:p>
+      <w:pPr>
+        <w:pStyle w:val="Code"/>
+      </w:pPr>
+      <w:r>
+        <w:rPr>
+          <w:rFonts w:ascii="Hiragino Sans" w:hAnsi="Hiragino Sans" w:eastAsia="Hiragino Sans"/>
+        </w:rPr>
+        <w:t>Mac</w:t>
+        <w:br/>
+        <w:t xml:space="preserve">  -&gt; Docker Desktop</w:t>
+        <w:br/>
+        <w:t xml:space="preserve">      -&gt; container: asic-rd-gf180-vnc</w:t>
+        <w:br/>
+        <w:t xml:space="preserve">          -&gt; Linux desktop + EDA tools + PDK</w:t>
+        <w:br/>
+        <w:t xml:space="preserve">          -&gt; web/VNC server : port 80</w:t>
+        <w:br/>
+        <w:t xml:space="preserve">  -&gt; Browser localhost:8080</w:t>
+      </w:r>
+    </w:p>
+    <w:tbl>
+      <w:tblPr>
+        <w:tblW w:type="dxa" w:w="9360"/>
+        <w:jc w:val="center"/>
+        <w:tblLayout w:type="fixed"/>
+        <w:tblLook w:firstColumn="1" w:firstRow="1" w:lastColumn="0" w:lastRow="0" w:noHBand="0" w:noVBand="1" w:val="04A0"/>
+        <w:tblInd w:w="120" w:type="dxa"/>
+      </w:tblPr>
+      <w:tblGrid>
+        <w:gridCol w:w="2500"/>
+        <w:gridCol w:w="6860"/>
+      </w:tblGrid>
+      <w:tr>
+        <w:trPr>
+          <w:tblHeader w:val="true"/>
+        </w:trPr>
+        <w:tc>
+          <w:tcPr>
+            <w:tcW w:type="dxa" w:w="2500"/>
+            <w:shd w:fill="E8EEF5"/>
+            <w:tcMar>
+              <w:top w:w="80" w:type="dxa"/>
+              <w:start w:w="120" w:type="dxa"/>
+              <w:bottom w:w="80" w:type="dxa"/>
+              <w:end w:w="120" w:type="dxa"/>
+            </w:tcMar>
+            <w:vAlign w:val="center"/>
+          </w:tcPr>
+          <w:p>
+            <w:r>
+              <w:rPr>
+                <w:rFonts w:ascii="Hiragino Sans" w:hAnsi="Hiragino Sans" w:eastAsia="Hiragino Sans"/>
+                <w:b/>
+                <w:color w:val="18364A"/>
+                <w:sz w:val="18"/>
+              </w:rPr>
+              <w:t>質問</w:t>
+            </w:r>
+          </w:p>
+        </w:tc>
+        <w:tc>
+          <w:tcPr>
+            <w:tcW w:type="dxa" w:w="6860"/>
+            <w:shd w:fill="E8EEF5"/>
+            <w:tcMar>
+              <w:top w:w="80" w:type="dxa"/>
+              <w:start w:w="120" w:type="dxa"/>
+              <w:bottom w:w="80" w:type="dxa"/>
+              <w:end w:w="120" w:type="dxa"/>
+            </w:tcMar>
+            <w:vAlign w:val="center"/>
+          </w:tcPr>
+          <w:p>
+            <w:r>
+              <w:rPr>
+                <w:rFonts w:ascii="Hiragino Sans" w:hAnsi="Hiragino Sans" w:eastAsia="Hiragino Sans"/>
+                <w:b/>
+                <w:color w:val="18364A"/>
+                <w:sz w:val="18"/>
+              </w:rPr>
+              <w:t>答え</w:t>
+            </w:r>
+          </w:p>
+        </w:tc>
+      </w:tr>
+      <w:tr>
+        <w:tc>
+          <w:tcPr>
+            <w:tcW w:type="dxa" w:w="2500"/>
+            <w:tcMar>
+              <w:top w:w="80" w:type="dxa"/>
+              <w:start w:w="120" w:type="dxa"/>
+              <w:bottom w:w="80" w:type="dxa"/>
+              <w:end w:w="120" w:type="dxa"/>
+            </w:tcMar>
+            <w:vAlign w:val="center"/>
+          </w:tcPr>
+          <w:p>
+            <w:pPr>
+              <w:spacing w:after="0" w:line="259" w:lineRule="auto"/>
+            </w:pPr>
+            <w:r>
+              <w:rPr>
+                <w:rFonts w:ascii="Hiragino Sans" w:hAnsi="Hiragino Sans" w:eastAsia="Hiragino Sans"/>
+                <w:sz w:val="18"/>
+              </w:rPr>
+              <w:t>IIC-OSIC-TOOLSには何が入る？</w:t>
+            </w:r>
+          </w:p>
+        </w:tc>
+        <w:tc>
+          <w:tcPr>
+            <w:tcW w:type="dxa" w:w="6860"/>
+            <w:tcMar>
+              <w:top w:w="80" w:type="dxa"/>
+              <w:start w:w="120" w:type="dxa"/>
+              <w:bottom w:w="80" w:type="dxa"/>
+              <w:end w:w="120" w:type="dxa"/>
+            </w:tcMar>
+            <w:vAlign w:val="center"/>
+          </w:tcPr>
+          <w:p>
+            <w:pPr>
+              <w:spacing w:after="0" w:line="259" w:lineRule="auto"/>
+            </w:pPr>
+            <w:r>
+              <w:rPr>
+                <w:rFonts w:ascii="Hiragino Sans" w:hAnsi="Hiragino Sans" w:eastAsia="Hiragino Sans"/>
+                <w:sz w:val="18"/>
+              </w:rPr>
+              <w:t>Linux user environment、Xschem、ngspice、KLayout、Magic、Netgen、Icarus Verilog、Yosys、OpenSTA、LibreLane/OpenROAD系、PDK、VNC/web server等。</w:t>
+            </w:r>
+          </w:p>
+        </w:tc>
+      </w:tr>
+      <w:tr>
+        <w:tc>
+          <w:tcPr>
+            <w:tcW w:type="dxa" w:w="2500"/>
+            <w:tcMar>
+              <w:top w:w="80" w:type="dxa"/>
+              <w:start w:w="120" w:type="dxa"/>
+              <w:bottom w:w="80" w:type="dxa"/>
+              <w:end w:w="120" w:type="dxa"/>
+            </w:tcMar>
+            <w:vAlign w:val="center"/>
+          </w:tcPr>
+          <w:p>
+            <w:pPr>
+              <w:spacing w:after="0" w:line="259" w:lineRule="auto"/>
+            </w:pPr>
+            <w:r>
+              <w:rPr>
+                <w:rFonts w:ascii="Hiragino Sans" w:hAnsi="Hiragino Sans" w:eastAsia="Hiragino Sans"/>
+                <w:sz w:val="18"/>
+              </w:rPr>
+              <w:t>一つの巨大application？</w:t>
+            </w:r>
+          </w:p>
+        </w:tc>
+        <w:tc>
+          <w:tcPr>
+            <w:tcW w:type="dxa" w:w="6860"/>
+            <w:tcMar>
+              <w:top w:w="80" w:type="dxa"/>
+              <w:start w:w="120" w:type="dxa"/>
+              <w:bottom w:w="80" w:type="dxa"/>
+              <w:end w:w="120" w:type="dxa"/>
+            </w:tcMar>
+            <w:vAlign w:val="center"/>
+          </w:tcPr>
+          <w:p>
+            <w:pPr>
+              <w:spacing w:after="0" w:line="259" w:lineRule="auto"/>
+            </w:pPr>
+            <w:r>
+              <w:rPr>
+                <w:rFonts w:ascii="Hiragino Sans" w:hAnsi="Hiragino Sans" w:eastAsia="Hiragino Sans"/>
+                <w:sz w:val="18"/>
+              </w:rPr>
+              <w:t>いいえ。独立toolとPDKをversion固定したLinux image。scriptやLibreLaneが必要なtoolを順番に呼ぶ。</w:t>
+            </w:r>
+          </w:p>
+        </w:tc>
+      </w:tr>
+      <w:tr>
+        <w:tc>
+          <w:tcPr>
+            <w:tcW w:type="dxa" w:w="2500"/>
+            <w:tcMar>
+              <w:top w:w="80" w:type="dxa"/>
+              <w:start w:w="120" w:type="dxa"/>
+              <w:bottom w:w="80" w:type="dxa"/>
+              <w:end w:w="120" w:type="dxa"/>
+            </w:tcMar>
+            <w:vAlign w:val="center"/>
+          </w:tcPr>
+          <w:p>
+            <w:pPr>
+              <w:spacing w:after="0" w:line="259" w:lineRule="auto"/>
+            </w:pPr>
+            <w:r>
+              <w:rPr>
+                <w:rFonts w:ascii="Hiragino Sans" w:hAnsi="Hiragino Sans" w:eastAsia="Hiragino Sans"/>
+                <w:sz w:val="18"/>
+              </w:rPr>
+              <w:t>学生の/fossは空？</w:t>
+            </w:r>
+          </w:p>
+        </w:tc>
+        <w:tc>
+          <w:tcPr>
+            <w:tcW w:type="dxa" w:w="6860"/>
+            <w:tcMar>
+              <w:top w:w="80" w:type="dxa"/>
+              <w:start w:w="120" w:type="dxa"/>
+              <w:bottom w:w="80" w:type="dxa"/>
+              <w:end w:w="120" w:type="dxa"/>
+            </w:tcMar>
+            <w:vAlign w:val="center"/>
+          </w:tcPr>
+          <w:p>
+            <w:pPr>
+              <w:spacing w:after="0" w:line="259" w:lineRule="auto"/>
+            </w:pPr>
+            <w:r>
+              <w:rPr>
+                <w:rFonts w:ascii="Hiragino Sans" w:hAnsi="Hiragino Sans" w:eastAsia="Hiragino Sans"/>
+                <w:sz w:val="18"/>
+              </w:rPr>
+              <w:t>/foss/pdks等はimageが提供。/foss/designsは学生がcloneしたrepositoryをMacからmountする。</w:t>
+            </w:r>
+          </w:p>
+        </w:tc>
+      </w:tr>
+      <w:tr>
+        <w:tc>
+          <w:tcPr>
+            <w:tcW w:type="dxa" w:w="2500"/>
+            <w:tcMar>
+              <w:top w:w="80" w:type="dxa"/>
+              <w:start w:w="120" w:type="dxa"/>
+              <w:bottom w:w="80" w:type="dxa"/>
+              <w:end w:w="120" w:type="dxa"/>
+            </w:tcMar>
+            <w:vAlign w:val="center"/>
+          </w:tcPr>
+          <w:p>
+            <w:pPr>
+              <w:spacing w:after="0" w:line="259" w:lineRule="auto"/>
+            </w:pPr>
+            <w:r>
+              <w:rPr>
+                <w:rFonts w:ascii="Hiragino Sans" w:hAnsi="Hiragino Sans" w:eastAsia="Hiragino Sans"/>
+                <w:sz w:val="18"/>
+              </w:rPr>
+              <w:t>編集結果は消える？</w:t>
+            </w:r>
+          </w:p>
+        </w:tc>
+        <w:tc>
+          <w:tcPr>
+            <w:tcW w:type="dxa" w:w="6860"/>
+            <w:tcMar>
+              <w:top w:w="80" w:type="dxa"/>
+              <w:start w:w="120" w:type="dxa"/>
+              <w:bottom w:w="80" w:type="dxa"/>
+              <w:end w:w="120" w:type="dxa"/>
+            </w:tcMar>
+            <w:vAlign w:val="center"/>
+          </w:tcPr>
+          <w:p>
+            <w:pPr>
+              <w:spacing w:after="0" w:line="259" w:lineRule="auto"/>
+            </w:pPr>
+            <w:r>
+              <w:rPr>
+                <w:rFonts w:ascii="Hiragino Sans" w:hAnsi="Hiragino Sans" w:eastAsia="Hiragino Sans"/>
+                <w:sz w:val="18"/>
+              </w:rPr>
+              <w:t>/foss/designs内はMac側repositoryへ直接書かれるので残る。container内部だけのfileはcontainer削除で失う可能性がある。</w:t>
+            </w:r>
+          </w:p>
+        </w:tc>
+      </w:tr>
+      <w:tr>
+        <w:tc>
+          <w:tcPr>
+            <w:tcW w:type="dxa" w:w="2500"/>
+            <w:tcMar>
+              <w:top w:w="80" w:type="dxa"/>
+              <w:start w:w="120" w:type="dxa"/>
+              <w:bottom w:w="80" w:type="dxa"/>
+              <w:end w:w="120" w:type="dxa"/>
+            </w:tcMar>
+            <w:vAlign w:val="center"/>
+          </w:tcPr>
+          <w:p>
+            <w:pPr>
+              <w:spacing w:after="0" w:line="259" w:lineRule="auto"/>
+            </w:pPr>
+            <w:r>
+              <w:rPr>
+                <w:rFonts w:ascii="Hiragino Sans" w:hAnsi="Hiragino Sans" w:eastAsia="Hiragino Sans"/>
+                <w:sz w:val="18"/>
+              </w:rPr>
+              <w:t>Connected to &lt;id&gt;とは？</w:t>
+            </w:r>
+          </w:p>
+        </w:tc>
+        <w:tc>
+          <w:tcPr>
+            <w:tcW w:type="dxa" w:w="6860"/>
+            <w:tcMar>
+              <w:top w:w="80" w:type="dxa"/>
+              <w:start w:w="120" w:type="dxa"/>
+              <w:bottom w:w="80" w:type="dxa"/>
+              <w:end w:w="120" w:type="dxa"/>
+            </w:tcMar>
+            <w:vAlign w:val="center"/>
+          </w:tcPr>
+          <w:p>
+            <w:pPr>
+              <w:spacing w:after="0" w:line="259" w:lineRule="auto"/>
+            </w:pPr>
+            <w:r>
+              <w:rPr>
+                <w:rFonts w:ascii="Hiragino Sans" w:hAnsi="Hiragino Sans" w:eastAsia="Hiragino Sans"/>
+                <w:sz w:val="18"/>
+              </w:rPr>
+              <w:t>起動中containerのdesktop sessionへbrowser VNCが接続済みという意味。</w:t>
+            </w:r>
+          </w:p>
+        </w:tc>
+      </w:tr>
+      <w:tr>
+        <w:tc>
+          <w:tcPr>
+            <w:tcW w:type="dxa" w:w="2500"/>
+            <w:tcMar>
+              <w:top w:w="80" w:type="dxa"/>
+              <w:start w:w="120" w:type="dxa"/>
+              <w:bottom w:w="80" w:type="dxa"/>
+              <w:end w:w="120" w:type="dxa"/>
+            </w:tcMar>
+            <w:vAlign w:val="center"/>
+          </w:tcPr>
+          <w:p>
+            <w:pPr>
+              <w:spacing w:after="0" w:line="259" w:lineRule="auto"/>
+            </w:pPr>
+            <w:r>
+              <w:rPr>
+                <w:rFonts w:ascii="Hiragino Sans" w:hAnsi="Hiragino Sans" w:eastAsia="Hiragino Sans"/>
+                <w:sz w:val="18"/>
+              </w:rPr>
+              <w:t>同じ環境を再現するには？</w:t>
+            </w:r>
+          </w:p>
+        </w:tc>
+        <w:tc>
+          <w:tcPr>
+            <w:tcW w:type="dxa" w:w="6860"/>
+            <w:tcMar>
+              <w:top w:w="80" w:type="dxa"/>
+              <w:start w:w="120" w:type="dxa"/>
+              <w:bottom w:w="80" w:type="dxa"/>
+              <w:end w:w="120" w:type="dxa"/>
+            </w:tcMar>
+            <w:vAlign w:val="center"/>
+          </w:tcPr>
+          <w:p>
+            <w:pPr>
+              <w:spacing w:after="0" w:line="259" w:lineRule="auto"/>
+            </w:pPr>
+            <w:r>
+              <w:rPr>
+                <w:rFonts w:ascii="Hiragino Sans" w:hAnsi="Hiragino Sans" w:eastAsia="Hiragino Sans"/>
+                <w:sz w:val="18"/>
+              </w:rPr>
+              <w:t>同じGit commit、同じimage tag/digest、同じMake targetを使う。</w:t>
+            </w:r>
+          </w:p>
+        </w:tc>
+      </w:tr>
+    </w:tbl>
+    <w:p>
+      <w:pPr>
+        <w:spacing w:after="0"/>
+      </w:pPr>
+    </w:p>
+    <w:p>
+      <w:pPr>
+        <w:pStyle w:val="Heading2"/>
+      </w:pPr>
+      <w:r>
+        <w:rPr>
+          <w:rFonts w:ascii="Hiragino Sans" w:hAnsi="Hiragino Sans" w:eastAsia="Hiragino Sans"/>
+        </w:rPr>
+        <w:t>volume mount</w:t>
+      </w:r>
+    </w:p>
+    <w:p>
+      <w:r>
+        <w:rPr>
+          <w:rFonts w:ascii="Hiragino Sans" w:hAnsi="Hiragino Sans" w:eastAsia="Hiragino Sans"/>
+        </w:rPr>
+        <w:t>eda-vnc.shの -v "$PROJECT_ROOT:/foss/designs:rw" が対応を作ります。PROJECT_ROOTはmake vncを実行したasic_rd repositoryです。</w:t>
+      </w:r>
+    </w:p>
+    <w:p>
+      <w:pPr>
+        <w:pStyle w:val="Code"/>
+      </w:pPr>
+      <w:r>
+        <w:rPr>
+          <w:rFonts w:ascii="Hiragino Sans" w:hAnsi="Hiragino Sans" w:eastAsia="Hiragino Sans"/>
+        </w:rPr>
+        <w:t>Student Mac: /Users/.../asic_rd</w:t>
+        <w:br/>
+        <w:t xml:space="preserve">                    | Docker bind mount</w:t>
+        <w:br/>
+        <w:t>Container:   /foss/designs</w:t>
+      </w:r>
+    </w:p>
+    <w:tbl>
+      <w:tblPr>
+        <w:tblW w:type="auto" w:w="0"/>
+        <w:jc w:val="center"/>
+        <w:tblLayout w:type="fixed"/>
+        <w:tblLook w:firstColumn="1" w:firstRow="1" w:lastColumn="0" w:lastRow="0" w:noHBand="0" w:noVBand="1" w:val="04A0"/>
+      </w:tblPr>
+      <w:tblGrid>
+        <w:gridCol w:w="9360"/>
+      </w:tblGrid>
+      <w:tr>
+        <w:tc>
+          <w:tcPr>
+            <w:tcW w:type="dxa" w:w="9360"/>
+            <w:tcMar>
+              <w:top w:w="130" w:type="dxa"/>
+              <w:start w:w="180" w:type="dxa"/>
+              <w:bottom w:w="130" w:type="dxa"/>
+              <w:end w:w="180" w:type="dxa"/>
+            </w:tcMar>
+            <w:shd w:fill="E8EEF5"/>
+          </w:tcPr>
+          <w:p>
+            <w:pPr>
+              <w:spacing w:after="0"/>
+            </w:pPr>
+            <w:r>
+              <w:rPr>
+                <w:rFonts w:ascii="Hiragino Sans" w:hAnsi="Hiragino Sans" w:eastAsia="Hiragino Sans"/>
+                <w:b/>
+                <w:color w:val="2E74B5"/>
+              </w:rPr>
+              <w:t xml:space="preserve">学生の開始手順  </w:t>
+            </w:r>
+            <w:r>
+              <w:rPr>
+                <w:rFonts w:ascii="Hiragino Sans" w:hAnsi="Hiragino Sans" w:eastAsia="Hiragino Sans"/>
+              </w:rPr>
+              <w:t>git clone後、必ずasic_rd directoryへcdしてmake vncを実行します。/foss/designsが空なら、cloneではなくmountと起動containerを確認します。</w:t>
+            </w:r>
+          </w:p>
+        </w:tc>
+      </w:tr>
+    </w:tbl>
+    <w:p>
+      <w:pPr>
+        <w:spacing w:after="0"/>
+      </w:pPr>
+    </w:p>
+    <w:p>
+      <w:r>
+        <w:rPr>
+          <w:rFonts w:ascii="Hiragino Sans" w:hAnsi="Hiragino Sans" w:eastAsia="Hiragino Sans"/>
+        </w:rPr>
+        <w:br w:type="page"/>
+      </w:r>
+    </w:p>
+    <w:p>
+      <w:pPr>
+        <w:pStyle w:val="Heading1"/>
+      </w:pPr>
+      <w:r>
+        <w:rPr>
+          <w:rFonts w:ascii="Hiragino Sans" w:hAnsi="Hiragino Sans" w:eastAsia="Hiragino Sans"/>
+        </w:rPr>
         <w:t>5. Xschemを初めて使う</w:t>
       </w:r>
     </w:p>
@@ -8280,7 +8782,639 @@
         <w:rPr>
           <w:rFonts w:ascii="Hiragino Sans" w:hAnsi="Hiragino Sans" w:eastAsia="Hiragino Sans"/>
         </w:rPr>
-        <w:t>5.1 Netlistとngspiceを追跡する</w:t>
+        <w:t>5.1 nmos_dc.schを開いた後</w:t>
+      </w:r>
+    </w:p>
+    <w:p>
+      <w:pPr>
+        <w:keepNext/>
+        <w:spacing w:after="60"/>
+        <w:jc w:val="center"/>
+      </w:pPr>
+      <w:r>
+        <w:rPr>
+          <w:rFonts w:ascii="Hiragino Sans" w:hAnsi="Hiragino Sans" w:eastAsia="Hiragino Sans"/>
+        </w:rPr>
+        <w:drawing>
+          <wp:inline xmlns:a="http://schemas.openxmlformats.org/drawingml/2006/main" xmlns:pic="http://schemas.openxmlformats.org/drawingml/2006/picture">
+            <wp:extent cx="5943600" cy="4202657"/>
+            <wp:docPr id="6" name="Picture 6"/>
+            <wp:cNvGraphicFramePr>
+              <a:graphicFrameLocks noChangeAspect="1"/>
+            </wp:cNvGraphicFramePr>
+            <a:graphic>
+              <a:graphicData uri="http://schemas.openxmlformats.org/drawingml/2006/picture">
+                <pic:pic>
+                  <pic:nvPicPr>
+                    <pic:cNvPr id="0" name="xschem_nmos_dc_open.png"/>
+                    <pic:cNvPicPr/>
+                  </pic:nvPicPr>
+                  <pic:blipFill>
+                    <a:blip r:embed="rId16"/>
+                    <a:stretch>
+                      <a:fillRect/>
+                    </a:stretch>
+                  </pic:blipFill>
+                  <pic:spPr>
+                    <a:xfrm>
+                      <a:off x="0" y="0"/>
+                      <a:ext cx="5943600" cy="4202657"/>
+                    </a:xfrm>
+                    <a:prstGeom prst="rect"/>
+                  </pic:spPr>
+                </pic:pic>
+              </a:graphicData>
+            </a:graphic>
+          </wp:inline>
+        </w:drawing>
+      </w:r>
+    </w:p>
+    <w:p>
+      <w:pPr>
+        <w:spacing w:after="160"/>
+        <w:jc w:val="center"/>
+      </w:pPr>
+      <w:r>
+        <w:rPr>
+          <w:rFonts w:ascii="Hiragino Sans" w:hAnsi="Hiragino Sans" w:eastAsia="Hiragino Sans"/>
+          <w:i/>
+          <w:color w:val="687680"/>
+          <w:sz w:val="17"/>
+        </w:rPr>
+        <w:t>図6　nmos_dc.schを開いた直後。右のgraphが空なのはRAW結果をまだ読み込んでいないため。</w:t>
+      </w:r>
+    </w:p>
+    <w:p>
+      <w:pPr>
+        <w:pStyle w:val="Heading2"/>
+      </w:pPr>
+      <w:r>
+        <w:rPr>
+          <w:rFonts w:ascii="Hiragino Sans" w:hAnsi="Hiragino Sans" w:eastAsia="Hiragino Sans"/>
+        </w:rPr>
+        <w:t>画面のどこを見るか</w:t>
+      </w:r>
+    </w:p>
+    <w:tbl>
+      <w:tblPr>
+        <w:tblW w:type="dxa" w:w="9360"/>
+        <w:jc w:val="center"/>
+        <w:tblLayout w:type="fixed"/>
+        <w:tblLook w:firstColumn="1" w:firstRow="1" w:lastColumn="0" w:lastRow="0" w:noHBand="0" w:noVBand="1" w:val="04A0"/>
+        <w:tblInd w:w="120" w:type="dxa"/>
+      </w:tblPr>
+      <w:tblGrid>
+        <w:gridCol w:w="2500"/>
+        <w:gridCol w:w="6860"/>
+      </w:tblGrid>
+      <w:tr>
+        <w:trPr>
+          <w:tblHeader w:val="true"/>
+        </w:trPr>
+        <w:tc>
+          <w:tcPr>
+            <w:tcW w:type="dxa" w:w="2500"/>
+            <w:shd w:fill="E8EEF5"/>
+            <w:tcMar>
+              <w:top w:w="80" w:type="dxa"/>
+              <w:start w:w="120" w:type="dxa"/>
+              <w:bottom w:w="80" w:type="dxa"/>
+              <w:end w:w="120" w:type="dxa"/>
+            </w:tcMar>
+            <w:vAlign w:val="center"/>
+          </w:tcPr>
+          <w:p>
+            <w:r>
+              <w:rPr>
+                <w:rFonts w:ascii="Hiragino Sans" w:hAnsi="Hiragino Sans" w:eastAsia="Hiragino Sans"/>
+                <w:b/>
+                <w:color w:val="18364A"/>
+                <w:sz w:val="18"/>
+              </w:rPr>
+              <w:t>場所</w:t>
+            </w:r>
+          </w:p>
+        </w:tc>
+        <w:tc>
+          <w:tcPr>
+            <w:tcW w:type="dxa" w:w="6860"/>
+            <w:shd w:fill="E8EEF5"/>
+            <w:tcMar>
+              <w:top w:w="80" w:type="dxa"/>
+              <w:start w:w="120" w:type="dxa"/>
+              <w:bottom w:w="80" w:type="dxa"/>
+              <w:end w:w="120" w:type="dxa"/>
+            </w:tcMar>
+            <w:vAlign w:val="center"/>
+          </w:tcPr>
+          <w:p>
+            <w:r>
+              <w:rPr>
+                <w:rFonts w:ascii="Hiragino Sans" w:hAnsi="Hiragino Sans" w:eastAsia="Hiragino Sans"/>
+                <w:b/>
+                <w:color w:val="18364A"/>
+                <w:sz w:val="18"/>
+              </w:rPr>
+              <w:t>内容</w:t>
+            </w:r>
+          </w:p>
+        </w:tc>
+      </w:tr>
+      <w:tr>
+        <w:tc>
+          <w:tcPr>
+            <w:tcW w:type="dxa" w:w="2500"/>
+            <w:tcMar>
+              <w:top w:w="80" w:type="dxa"/>
+              <w:start w:w="120" w:type="dxa"/>
+              <w:bottom w:w="80" w:type="dxa"/>
+              <w:end w:w="120" w:type="dxa"/>
+            </w:tcMar>
+            <w:vAlign w:val="center"/>
+          </w:tcPr>
+          <w:p>
+            <w:pPr>
+              <w:spacing w:after="0" w:line="259" w:lineRule="auto"/>
+            </w:pPr>
+            <w:r>
+              <w:rPr>
+                <w:rFonts w:ascii="Hiragino Sans" w:hAnsi="Hiragino Sans" w:eastAsia="Hiragino Sans"/>
+                <w:sz w:val="18"/>
+              </w:rPr>
+              <w:t>左中央</w:t>
+            </w:r>
+          </w:p>
+        </w:tc>
+        <w:tc>
+          <w:tcPr>
+            <w:tcW w:type="dxa" w:w="6860"/>
+            <w:tcMar>
+              <w:top w:w="80" w:type="dxa"/>
+              <w:start w:w="120" w:type="dxa"/>
+              <w:bottom w:w="80" w:type="dxa"/>
+              <w:end w:w="120" w:type="dxa"/>
+            </w:tcMar>
+            <w:vAlign w:val="center"/>
+          </w:tcPr>
+          <w:p>
+            <w:pPr>
+              <w:spacing w:after="0" w:line="259" w:lineRule="auto"/>
+            </w:pPr>
+            <w:r>
+              <w:rPr>
+                <w:rFonts w:ascii="Hiragino Sans" w:hAnsi="Hiragino Sans" w:eastAsia="Hiragino Sans"/>
+                <w:sz w:val="18"/>
+              </w:rPr>
+              <w:t>GF180 3.3 V NMOS。G/D/S/Bの4端子、W=1 µm、L=0.28 µm</w:t>
+            </w:r>
+          </w:p>
+        </w:tc>
+      </w:tr>
+      <w:tr>
+        <w:tc>
+          <w:tcPr>
+            <w:tcW w:type="dxa" w:w="2500"/>
+            <w:tcMar>
+              <w:top w:w="80" w:type="dxa"/>
+              <w:start w:w="120" w:type="dxa"/>
+              <w:bottom w:w="80" w:type="dxa"/>
+              <w:end w:w="120" w:type="dxa"/>
+            </w:tcMar>
+            <w:vAlign w:val="center"/>
+          </w:tcPr>
+          <w:p>
+            <w:pPr>
+              <w:spacing w:after="0" w:line="259" w:lineRule="auto"/>
+            </w:pPr>
+            <w:r>
+              <w:rPr>
+                <w:rFonts w:ascii="Hiragino Sans" w:hAnsi="Hiragino Sans" w:eastAsia="Hiragino Sans"/>
+                <w:sz w:val="18"/>
+              </w:rPr>
+              <w:t>中央</w:t>
+            </w:r>
+          </w:p>
+        </w:tc>
+        <w:tc>
+          <w:tcPr>
+            <w:tcW w:type="dxa" w:w="6860"/>
+            <w:tcMar>
+              <w:top w:w="80" w:type="dxa"/>
+              <w:start w:w="120" w:type="dxa"/>
+              <w:bottom w:w="80" w:type="dxa"/>
+              <w:end w:w="120" w:type="dxa"/>
+            </w:tcMar>
+            <w:vAlign w:val="center"/>
+          </w:tcPr>
+          <w:p>
+            <w:pPr>
+              <w:spacing w:after="0" w:line="259" w:lineRule="auto"/>
+            </w:pPr>
+            <w:r>
+              <w:rPr>
+                <w:rFonts w:ascii="Hiragino Sans" w:hAnsi="Hiragino Sans" w:eastAsia="Hiragino Sans"/>
+                <w:sz w:val="18"/>
+              </w:rPr>
+              <w:t>ngspice command。VDSを0–3.3 V、VGSを0–3.3 Vでsweep</w:t>
+            </w:r>
+          </w:p>
+        </w:tc>
+      </w:tr>
+      <w:tr>
+        <w:tc>
+          <w:tcPr>
+            <w:tcW w:type="dxa" w:w="2500"/>
+            <w:tcMar>
+              <w:top w:w="80" w:type="dxa"/>
+              <w:start w:w="120" w:type="dxa"/>
+              <w:bottom w:w="80" w:type="dxa"/>
+              <w:end w:w="120" w:type="dxa"/>
+            </w:tcMar>
+            <w:vAlign w:val="center"/>
+          </w:tcPr>
+          <w:p>
+            <w:pPr>
+              <w:spacing w:after="0" w:line="259" w:lineRule="auto"/>
+            </w:pPr>
+            <w:r>
+              <w:rPr>
+                <w:rFonts w:ascii="Hiragino Sans" w:hAnsi="Hiragino Sans" w:eastAsia="Hiragino Sans"/>
+                <w:sz w:val="18"/>
+              </w:rPr>
+              <w:t>左下</w:t>
+            </w:r>
+          </w:p>
+        </w:tc>
+        <w:tc>
+          <w:tcPr>
+            <w:tcW w:type="dxa" w:w="6860"/>
+            <w:tcMar>
+              <w:top w:w="80" w:type="dxa"/>
+              <w:start w:w="120" w:type="dxa"/>
+              <w:bottom w:w="80" w:type="dxa"/>
+              <w:end w:w="120" w:type="dxa"/>
+            </w:tcMar>
+            <w:vAlign w:val="center"/>
+          </w:tcPr>
+          <w:p>
+            <w:pPr>
+              <w:spacing w:after="0" w:line="259" w:lineRule="auto"/>
+            </w:pPr>
+            <w:r>
+              <w:rPr>
+                <w:rFonts w:ascii="Hiragino Sans" w:hAnsi="Hiragino Sans" w:eastAsia="Hiragino Sans"/>
+                <w:sz w:val="18"/>
+              </w:rPr>
+              <w:t>GF180 model includeとtypical library選択</w:t>
+            </w:r>
+          </w:p>
+        </w:tc>
+      </w:tr>
+      <w:tr>
+        <w:tc>
+          <w:tcPr>
+            <w:tcW w:type="dxa" w:w="2500"/>
+            <w:tcMar>
+              <w:top w:w="80" w:type="dxa"/>
+              <w:start w:w="120" w:type="dxa"/>
+              <w:bottom w:w="80" w:type="dxa"/>
+              <w:end w:w="120" w:type="dxa"/>
+            </w:tcMar>
+            <w:vAlign w:val="center"/>
+          </w:tcPr>
+          <w:p>
+            <w:pPr>
+              <w:spacing w:after="0" w:line="259" w:lineRule="auto"/>
+            </w:pPr>
+            <w:r>
+              <w:rPr>
+                <w:rFonts w:ascii="Hiragino Sans" w:hAnsi="Hiragino Sans" w:eastAsia="Hiragino Sans"/>
+                <w:sz w:val="18"/>
+              </w:rPr>
+              <w:t>右</w:t>
+            </w:r>
+          </w:p>
+        </w:tc>
+        <w:tc>
+          <w:tcPr>
+            <w:tcW w:type="dxa" w:w="6860"/>
+            <w:tcMar>
+              <w:top w:w="80" w:type="dxa"/>
+              <w:start w:w="120" w:type="dxa"/>
+              <w:bottom w:w="80" w:type="dxa"/>
+              <w:end w:w="120" w:type="dxa"/>
+            </w:tcMar>
+            <w:vAlign w:val="center"/>
+          </w:tcPr>
+          <w:p>
+            <w:pPr>
+              <w:spacing w:after="0" w:line="259" w:lineRule="auto"/>
+            </w:pPr>
+            <w:r>
+              <w:rPr>
+                <w:rFonts w:ascii="Hiragino Sans" w:hAnsi="Hiragino Sans" w:eastAsia="Hiragino Sans"/>
+                <w:sz w:val="18"/>
+              </w:rPr>
+              <w:t>i(vd)を表示するgraph。縦軸はdrain current、横軸はVDS</w:t>
+            </w:r>
+          </w:p>
+        </w:tc>
+      </w:tr>
+      <w:tr>
+        <w:tc>
+          <w:tcPr>
+            <w:tcW w:type="dxa" w:w="2500"/>
+            <w:tcMar>
+              <w:top w:w="80" w:type="dxa"/>
+              <w:start w:w="120" w:type="dxa"/>
+              <w:bottom w:w="80" w:type="dxa"/>
+              <w:end w:w="120" w:type="dxa"/>
+            </w:tcMar>
+            <w:vAlign w:val="center"/>
+          </w:tcPr>
+          <w:p>
+            <w:pPr>
+              <w:spacing w:after="0" w:line="259" w:lineRule="auto"/>
+            </w:pPr>
+            <w:r>
+              <w:rPr>
+                <w:rFonts w:ascii="Hiragino Sans" w:hAnsi="Hiragino Sans" w:eastAsia="Hiragino Sans"/>
+                <w:sz w:val="18"/>
+              </w:rPr>
+              <w:t>左上の緑矢印</w:t>
+            </w:r>
+          </w:p>
+        </w:tc>
+        <w:tc>
+          <w:tcPr>
+            <w:tcW w:type="dxa" w:w="6860"/>
+            <w:tcMar>
+              <w:top w:w="80" w:type="dxa"/>
+              <w:start w:w="120" w:type="dxa"/>
+              <w:bottom w:w="80" w:type="dxa"/>
+              <w:end w:w="120" w:type="dxa"/>
+            </w:tcMar>
+            <w:vAlign w:val="center"/>
+          </w:tcPr>
+          <w:p>
+            <w:pPr>
+              <w:spacing w:after="0" w:line="259" w:lineRule="auto"/>
+            </w:pPr>
+            <w:r>
+              <w:rPr>
+                <w:rFonts w:ascii="Hiragino Sans" w:hAnsi="Hiragino Sans" w:eastAsia="Hiragino Sans"/>
+                <w:sz w:val="18"/>
+              </w:rPr>
+              <w:t>work/nmos_dc.rawをXschemへ読み込むlauncher</w:t>
+            </w:r>
+          </w:p>
+        </w:tc>
+      </w:tr>
+    </w:tbl>
+    <w:p>
+      <w:pPr>
+        <w:spacing w:after="0"/>
+      </w:pPr>
+    </w:p>
+    <w:p>
+      <w:r>
+        <w:rPr>
+          <w:rFonts w:ascii="Hiragino Sans" w:hAnsi="Hiragino Sans" w:eastAsia="Hiragino Sans"/>
+        </w:rPr>
+        <w:br w:type="page"/>
+      </w:r>
+    </w:p>
+    <w:p>
+      <w:pPr>
+        <w:pStyle w:val="Heading1"/>
+      </w:pPr>
+      <w:r>
+        <w:rPr>
+          <w:rFonts w:ascii="Hiragino Sans" w:hAnsi="Hiragino Sans" w:eastAsia="Hiragino Sans"/>
+        </w:rPr>
+        <w:t>5.2 最初の波形を表示する</w:t>
+      </w:r>
+    </w:p>
+    <w:p>
+      <w:pPr>
+        <w:pStyle w:val="ListNumber"/>
+      </w:pPr>
+      <w:r>
+        <w:rPr>
+          <w:rFonts w:ascii="Hiragino Sans" w:hAnsi="Hiragino Sans" w:eastAsia="Hiragino Sans"/>
+        </w:rPr>
+        <w:t>Mac terminalでrepository直下から make nmos-dc を実行する。すでに実行済みならwork/nmos_dc.rawが存在する。</w:t>
+      </w:r>
+    </w:p>
+    <w:p>
+      <w:pPr>
+        <w:pStyle w:val="ListNumber"/>
+      </w:pPr>
+      <w:r>
+        <w:rPr>
+          <w:rFonts w:ascii="Hiragino Sans" w:hAnsi="Hiragino Sans" w:eastAsia="Hiragino Sans"/>
+        </w:rPr>
+        <w:t>Xschem画面左上の緑矢印『Load simulation results』を一度クリックする。</w:t>
+      </w:r>
+    </w:p>
+    <w:p>
+      <w:pPr>
+        <w:pStyle w:val="ListNumber"/>
+      </w:pPr>
+      <w:r>
+        <w:rPr>
+          <w:rFonts w:ascii="Hiragino Sans" w:hAnsi="Hiragino Sans" w:eastAsia="Hiragino Sans"/>
+        </w:rPr>
+        <w:t>右側graphに複数のId-Vds curveが現れることを確認する。</w:t>
+      </w:r>
+    </w:p>
+    <w:p>
+      <w:pPr>
+        <w:pStyle w:val="ListNumber"/>
+      </w:pPr>
+      <w:r>
+        <w:rPr>
+          <w:rFonts w:ascii="Hiragino Sans" w:hAnsi="Hiragino Sans" w:eastAsia="Hiragino Sans"/>
+        </w:rPr>
+        <w:t>curveが見えなければXschemを開いたdirectoryが /foss/designs/simulations/gf180_nmos_dc か確認する。</w:t>
+      </w:r>
+    </w:p>
+    <w:p>
+      <w:pPr>
+        <w:pStyle w:val="ListNumber"/>
+      </w:pPr>
+      <w:r>
+        <w:rPr>
+          <w:rFonts w:ascii="Hiragino Sans" w:hAnsi="Hiragino Sans" w:eastAsia="Hiragino Sans"/>
+        </w:rPr>
+        <w:t>Terminalで ls -lh work/nmos_dc.raw を実行し、fileが0 byteでないか確認する。</w:t>
+      </w:r>
+    </w:p>
+    <w:p>
+      <w:pPr>
+        <w:pStyle w:val="ListNumber"/>
+      </w:pPr>
+      <w:r>
+        <w:rPr>
+          <w:rFonts w:ascii="Hiragino Sans" w:hAnsi="Hiragino Sans" w:eastAsia="Hiragino Sans"/>
+        </w:rPr>
+        <w:t>必要なら make nmos-dc を再実行し、Xschemで再度Load simulation resultsを押す。</w:t>
+      </w:r>
+    </w:p>
+    <w:p>
+      <w:pPr>
+        <w:pStyle w:val="Code"/>
+      </w:pPr>
+      <w:r>
+        <w:rPr>
+          <w:rFonts w:ascii="Hiragino Sans" w:hAnsi="Hiragino Sans" w:eastAsia="Hiragino Sans"/>
+        </w:rPr>
+        <w:t># Mac terminal</w:t>
+        <w:br/>
+        <w:t>cd /Users/ykeisuke/Desktop/mywork/asic_rd</w:t>
+        <w:br/>
+        <w:t>make nmos-dc</w:t>
+        <w:br/>
+        <w:br/>
+        <w:t># Container terminalで確認する場合</w:t>
+        <w:br/>
+        <w:t>cd /foss/designs/simulations/gf180_nmos_dc</w:t>
+        <w:br/>
+        <w:t>ls -lh work/nmos_dc.raw</w:t>
+      </w:r>
+    </w:p>
+    <w:p>
+      <w:pPr>
+        <w:pStyle w:val="Heading2"/>
+      </w:pPr>
+      <w:r>
+        <w:rPr>
+          <w:rFonts w:ascii="Hiragino Sans" w:hAnsi="Hiragino Sans" w:eastAsia="Hiragino Sans"/>
+        </w:rPr>
+        <w:t>表示後に読み取ること</w:t>
+      </w:r>
+    </w:p>
+    <w:p>
+      <w:pPr>
+        <w:pStyle w:val="ListBullet"/>
+      </w:pPr>
+      <w:r>
+        <w:rPr>
+          <w:rFonts w:ascii="Hiragino Sans" w:hAnsi="Hiragino Sans" w:eastAsia="Hiragino Sans"/>
+        </w:rPr>
+        <w:t>VGSが高いcurveほどdrain currentが大きい。</w:t>
+      </w:r>
+    </w:p>
+    <w:p>
+      <w:pPr>
+        <w:pStyle w:val="ListBullet"/>
+      </w:pPr>
+      <w:r>
+        <w:rPr>
+          <w:rFonts w:ascii="Hiragino Sans" w:hAnsi="Hiragino Sans" w:eastAsia="Hiragino Sans"/>
+        </w:rPr>
+        <w:t>低VDSでは電流がVDSに強く依存し、VDS増加後は傾きが小さくなる。</w:t>
+      </w:r>
+    </w:p>
+    <w:p>
+      <w:pPr>
+        <w:pStyle w:val="ListBullet"/>
+      </w:pPr>
+      <w:r>
+        <w:rPr>
+          <w:rFonts w:ascii="Hiragino Sans" w:hAnsi="Hiragino Sans" w:eastAsia="Hiragino Sans"/>
+        </w:rPr>
+        <w:t>縦軸のuはµA。800uは800 µA。</w:t>
+      </w:r>
+    </w:p>
+    <w:p>
+      <w:pPr>
+        <w:pStyle w:val="ListBullet"/>
+      </w:pPr>
+      <w:r>
+        <w:rPr>
+          <w:rFonts w:ascii="Hiragino Sans" w:hAnsi="Hiragino Sans" w:eastAsia="Hiragino Sans"/>
+        </w:rPr>
+        <w:t>graphのcurve数はVGS sweep点に対応する。</w:t>
+      </w:r>
+    </w:p>
+    <w:p>
+      <w:pPr>
+        <w:pStyle w:val="ListBullet"/>
+      </w:pPr>
+      <w:r>
+        <w:rPr>
+          <w:rFonts w:ascii="Hiragino Sans" w:hAnsi="Hiragino Sans" w:eastAsia="Hiragino Sans"/>
+        </w:rPr>
+        <w:t>この結果はtypical modelのnominal DC sweepであり、PVT保証ではない。</w:t>
+      </w:r>
+    </w:p>
+    <w:tbl>
+      <w:tblPr>
+        <w:tblW w:type="auto" w:w="0"/>
+        <w:jc w:val="center"/>
+        <w:tblLayout w:type="fixed"/>
+        <w:tblLook w:firstColumn="1" w:firstRow="1" w:lastColumn="0" w:lastRow="0" w:noHBand="0" w:noVBand="1" w:val="04A0"/>
+      </w:tblPr>
+      <w:tblGrid>
+        <w:gridCol w:w="9360"/>
+      </w:tblGrid>
+      <w:tr>
+        <w:tc>
+          <w:tcPr>
+            <w:tcW w:type="dxa" w:w="9360"/>
+            <w:tcMar>
+              <w:top w:w="130" w:type="dxa"/>
+              <w:start w:w="180" w:type="dxa"/>
+              <w:bottom w:w="130" w:type="dxa"/>
+              <w:end w:w="180" w:type="dxa"/>
+            </w:tcMar>
+            <w:shd w:fill="E8EEF5"/>
+          </w:tcPr>
+          <w:p>
+            <w:pPr>
+              <w:spacing w:after="0"/>
+            </w:pPr>
+            <w:r>
+              <w:rPr>
+                <w:rFonts w:ascii="Hiragino Sans" w:hAnsi="Hiragino Sans" w:eastAsia="Hiragino Sans"/>
+                <w:b/>
+                <w:color w:val="2E74B5"/>
+              </w:rPr>
+              <w:t xml:space="preserve">ここでの到達点  </w:t>
+            </w:r>
+            <w:r>
+              <w:rPr>
+                <w:rFonts w:ascii="Hiragino Sans" w:hAnsi="Hiragino Sans" w:eastAsia="Hiragino Sans"/>
+              </w:rPr>
+              <w:t>自分でRAWを読み込み、curveを表示し、VGS/VDS/ID/W/L/model cornerを説明できればLab 1へ進めます。</w:t>
+            </w:r>
+          </w:p>
+        </w:tc>
+      </w:tr>
+    </w:tbl>
+    <w:p>
+      <w:pPr>
+        <w:spacing w:after="0"/>
+      </w:pPr>
+    </w:p>
+    <w:p>
+      <w:r>
+        <w:rPr>
+          <w:rFonts w:ascii="Hiragino Sans" w:hAnsi="Hiragino Sans" w:eastAsia="Hiragino Sans"/>
+        </w:rPr>
+        <w:br w:type="page"/>
+      </w:r>
+    </w:p>
+    <w:p>
+      <w:pPr>
+        <w:pStyle w:val="Heading1"/>
+      </w:pPr>
+      <w:r>
+        <w:rPr>
+          <w:rFonts w:ascii="Hiragino Sans" w:hAnsi="Hiragino Sans" w:eastAsia="Hiragino Sans"/>
+        </w:rPr>
+        <w:t>5.3 Netlistとngspiceを追跡する</w:t>
       </w:r>
     </w:p>
     <w:p>
@@ -8858,7 +9992,7 @@
         <w:rPr>
           <w:rFonts w:ascii="Hiragino Sans" w:hAnsi="Hiragino Sans" w:eastAsia="Hiragino Sans"/>
         </w:rPr>
-        <w:t>5.2 Digital toolの使い分け</w:t>
+        <w:t>5.4 Digital toolの使い分け</w:t>
       </w:r>
     </w:p>
     <w:tbl>
@@ -11351,7 +12485,7 @@
         <w:drawing>
           <wp:inline xmlns:a="http://schemas.openxmlformats.org/drawingml/2006/main" xmlns:pic="http://schemas.openxmlformats.org/drawingml/2006/picture">
             <wp:extent cx="5897880" cy="3191794"/>
-            <wp:docPr id="6" name="Picture 6"/>
+            <wp:docPr id="7" name="Picture 7"/>
             <wp:cNvGraphicFramePr>
               <a:graphicFrameLocks noChangeAspect="1"/>
             </wp:cNvGraphicFramePr>
@@ -11363,7 +12497,7 @@
                     <pic:cNvPicPr/>
                   </pic:nvPicPr>
                   <pic:blipFill>
-                    <a:blip r:embed="rId16"/>
+                    <a:blip r:embed="rId17"/>
                     <a:stretch>
                       <a:fillRect/>
                     </a:stretch>
@@ -12821,7 +13955,7 @@
         <w:drawing>
           <wp:inline xmlns:a="http://schemas.openxmlformats.org/drawingml/2006/main" xmlns:pic="http://schemas.openxmlformats.org/drawingml/2006/picture">
             <wp:extent cx="5669280" cy="2456688"/>
-            <wp:docPr id="7" name="Picture 7"/>
+            <wp:docPr id="8" name="Picture 8"/>
             <wp:cNvGraphicFramePr>
               <a:graphicFrameLocks noChangeAspect="1"/>
             </wp:cNvGraphicFramePr>
@@ -12833,7 +13967,7 @@
                     <pic:cNvPicPr/>
                   </pic:nvPicPr>
                   <pic:blipFill>
-                    <a:blip r:embed="rId17"/>
+                    <a:blip r:embed="rId18"/>
                     <a:stretch>
                       <a:fillRect/>
                     </a:stretch>
@@ -13523,7 +14657,7 @@
         <w:drawing>
           <wp:inline xmlns:a="http://schemas.openxmlformats.org/drawingml/2006/main" xmlns:pic="http://schemas.openxmlformats.org/drawingml/2006/picture">
             <wp:extent cx="4846320" cy="5248565"/>
-            <wp:docPr id="8" name="Picture 8"/>
+            <wp:docPr id="9" name="Picture 9"/>
             <wp:cNvGraphicFramePr>
               <a:graphicFrameLocks noChangeAspect="1"/>
             </wp:cNvGraphicFramePr>
@@ -13535,7 +14669,7 @@
                     <pic:cNvPicPr/>
                   </pic:nvPicPr>
                   <pic:blipFill>
-                    <a:blip r:embed="rId18"/>
+                    <a:blip r:embed="rId19"/>
                     <a:stretch>
                       <a:fillRect/>
                     </a:stretch>

</xml_diff>

<commit_message>
Reorganize handbook and document NMOS result
</commit_message>
<xml_diff>
--- a/docs/lecture/IRSX_ASIC_Student_Lab_Handbook_JP.docx
+++ b/docs/lecture/IRSX_ASIC_Student_Lab_Handbook_JP.docx
@@ -3906,7 +3906,7 @@
     </w:p>
     <w:p>
       <w:pPr>
-        <w:pStyle w:val="Heading1"/>
+        <w:pStyle w:val="Heading2"/>
       </w:pPr>
       <w:r>
         <w:rPr>
@@ -4196,7 +4196,7 @@
     </w:p>
     <w:p>
       <w:pPr>
-        <w:pStyle w:val="Heading1"/>
+        <w:pStyle w:val="Heading2"/>
       </w:pPr>
       <w:r>
         <w:rPr>
@@ -5896,7 +5896,7 @@
     </w:p>
     <w:p>
       <w:pPr>
-        <w:pStyle w:val="Heading1"/>
+        <w:pStyle w:val="Heading2"/>
       </w:pPr>
       <w:r>
         <w:rPr>
@@ -6409,7 +6409,7 @@
         <w:rPr>
           <w:rFonts w:ascii="Hiragino Sans" w:hAnsi="Hiragino Sans" w:eastAsia="Hiragino Sans"/>
         </w:rPr>
-        <w:t>1. 全体設計フロー</w:t>
+        <w:t>5. 全体設計フロー</w:t>
       </w:r>
     </w:p>
     <w:p>
@@ -7592,7 +7592,7 @@
         <w:rPr>
           <w:rFonts w:ascii="Hiragino Sans" w:hAnsi="Hiragino Sans" w:eastAsia="Hiragino Sans"/>
         </w:rPr>
-        <w:t>2. Mac + Docker開発環境</w:t>
+        <w:t>6. Mac + Docker開発環境</w:t>
       </w:r>
     </w:p>
     <w:p>
@@ -8022,13 +8022,13 @@
     </w:p>
     <w:p>
       <w:pPr>
-        <w:pStyle w:val="Heading1"/>
+        <w:pStyle w:val="Heading2"/>
       </w:pPr>
       <w:r>
         <w:rPr>
           <w:rFonts w:ascii="Hiragino Sans" w:hAnsi="Hiragino Sans" w:eastAsia="Hiragino Sans"/>
         </w:rPr>
-        <w:t>2.1 Docker・VNC・/fossの関係</w:t>
+        <w:t>6.1 Docker・VNC・/fossの関係</w:t>
       </w:r>
     </w:p>
     <w:p>
@@ -8530,7 +8530,7 @@
         <w:rPr>
           <w:rFonts w:ascii="Hiragino Sans" w:hAnsi="Hiragino Sans" w:eastAsia="Hiragino Sans"/>
         </w:rPr>
-        <w:t>5. Xschemを初めて使う</w:t>
+        <w:t>7. Xschemを初めて使う</w:t>
       </w:r>
     </w:p>
     <w:p>
@@ -8776,13 +8776,13 @@
     </w:p>
     <w:p>
       <w:pPr>
-        <w:pStyle w:val="Heading1"/>
+        <w:pStyle w:val="Heading2"/>
       </w:pPr>
       <w:r>
         <w:rPr>
           <w:rFonts w:ascii="Hiragino Sans" w:hAnsi="Hiragino Sans" w:eastAsia="Hiragino Sans"/>
         </w:rPr>
-        <w:t>5.1 nmos_dc.schを開いた後</w:t>
+        <w:t>7.1 nmos_dc.schを開いた後</w:t>
       </w:r>
     </w:p>
     <w:p>
@@ -9115,7 +9115,7 @@
                 <w:rFonts w:ascii="Hiragino Sans" w:hAnsi="Hiragino Sans" w:eastAsia="Hiragino Sans"/>
                 <w:sz w:val="18"/>
               </w:rPr>
-              <w:t>i(vd)を表示するgraph。縦軸はdrain current、横軸はVDS</w:t>
+              <w:t>i(vd) -1 *を表示するgraph。縦軸はdrain current、横軸はVDS</w:t>
             </w:r>
           </w:p>
         </w:tc>
@@ -9186,13 +9186,13 @@
     </w:p>
     <w:p>
       <w:pPr>
-        <w:pStyle w:val="Heading1"/>
+        <w:pStyle w:val="Heading2"/>
       </w:pPr>
       <w:r>
         <w:rPr>
           <w:rFonts w:ascii="Hiragino Sans" w:hAnsi="Hiragino Sans" w:eastAsia="Hiragino Sans"/>
         </w:rPr>
-        <w:t>5.2 最初の波形を表示する</w:t>
+        <w:t>7.2 最初の波形を表示する</w:t>
       </w:r>
     </w:p>
     <w:p>
@@ -9214,7 +9214,7 @@
         <w:rPr>
           <w:rFonts w:ascii="Hiragino Sans" w:hAnsi="Hiragino Sans" w:eastAsia="Hiragino Sans"/>
         </w:rPr>
-        <w:t>Xschem画面左上の緑矢印『Load simulation results』を一度クリックする。</w:t>
+        <w:t>Xschem画面左上の緑矢印『Load simulation results』をCtrl + 左クリックする。通常のクリックやダブルクリックはlauncherの選択またはproperty編集になる。</w:t>
       </w:r>
     </w:p>
     <w:p>
@@ -9258,7 +9258,7 @@
         <w:rPr>
           <w:rFonts w:ascii="Hiragino Sans" w:hAnsi="Hiragino Sans" w:eastAsia="Hiragino Sans"/>
         </w:rPr>
-        <w:t>必要なら make nmos-dc を再実行し、Xschemで再度Load simulation resultsを押す。</w:t>
+        <w:t>必要なら make nmos-dc を再実行し、Xschemを閉じて開き直してから、再度Ctrl + 左クリックする。</w:t>
       </w:r>
     </w:p>
     <w:p>
@@ -9283,6 +9283,114 @@
         <w:t>ls -lh work/nmos_dc.raw</w:t>
       </w:r>
     </w:p>
+    <w:tbl>
+      <w:tblPr>
+        <w:tblW w:type="auto" w:w="0"/>
+        <w:jc w:val="center"/>
+        <w:tblLayout w:type="fixed"/>
+        <w:tblLook w:firstColumn="1" w:firstRow="1" w:lastColumn="0" w:lastRow="0" w:noHBand="0" w:noVBand="1" w:val="04A0"/>
+      </w:tblPr>
+      <w:tblGrid>
+        <w:gridCol w:w="9360"/>
+      </w:tblGrid>
+      <w:tr>
+        <w:tc>
+          <w:tcPr>
+            <w:tcW w:type="dxa" w:w="9360"/>
+            <w:tcMar>
+              <w:top w:w="130" w:type="dxa"/>
+              <w:start w:w="180" w:type="dxa"/>
+              <w:bottom w:w="130" w:type="dxa"/>
+              <w:end w:w="180" w:type="dxa"/>
+            </w:tcMar>
+            <w:shd w:fill="FFF1D8"/>
+          </w:tcPr>
+          <w:p>
+            <w:pPr>
+              <w:spacing w:after="0"/>
+            </w:pPr>
+            <w:r>
+              <w:rPr>
+                <w:rFonts w:ascii="Hiragino Sans" w:hAnsi="Hiragino Sans" w:eastAsia="Hiragino Sans"/>
+                <w:b/>
+                <w:color w:val="2E74B5"/>
+              </w:rPr>
+              <w:t xml:space="preserve">RAWを開けない場合  </w:t>
+            </w:r>
+            <w:r>
+              <w:rPr>
+                <w:rFonts w:ascii="Hiragino Sans" w:hAnsi="Hiragino Sans" w:eastAsia="Hiragino Sans"/>
+              </w:rPr>
+              <w:t>raw_read(): failed to open ... と表示されたら、Xschemを /foss/designs/simulations/gf180_nmos_dc から起動しているか確認します。古い回路図を開いたままprojectを更新した場合は、一度閉じて開き直します。</w:t>
+            </w:r>
+          </w:p>
+        </w:tc>
+      </w:tr>
+    </w:tbl>
+    <w:p>
+      <w:pPr>
+        <w:spacing w:after="0"/>
+      </w:pPr>
+    </w:p>
+    <w:p>
+      <w:pPr>
+        <w:keepNext/>
+        <w:spacing w:after="60"/>
+        <w:jc w:val="center"/>
+      </w:pPr>
+      <w:r>
+        <w:rPr>
+          <w:rFonts w:ascii="Hiragino Sans" w:hAnsi="Hiragino Sans" w:eastAsia="Hiragino Sans"/>
+        </w:rPr>
+        <w:drawing>
+          <wp:inline xmlns:a="http://schemas.openxmlformats.org/drawingml/2006/main" xmlns:pic="http://schemas.openxmlformats.org/drawingml/2006/picture">
+            <wp:extent cx="5943600" cy="4677208"/>
+            <wp:docPr id="7" name="Picture 7"/>
+            <wp:cNvGraphicFramePr>
+              <a:graphicFrameLocks noChangeAspect="1"/>
+            </wp:cNvGraphicFramePr>
+            <a:graphic>
+              <a:graphicData uri="http://schemas.openxmlformats.org/drawingml/2006/picture">
+                <pic:pic>
+                  <pic:nvPicPr>
+                    <pic:cNvPr id="0" name="xschem_nmos_dc_result.png"/>
+                    <pic:cNvPicPr/>
+                  </pic:nvPicPr>
+                  <pic:blipFill>
+                    <a:blip r:embed="rId17"/>
+                    <a:stretch>
+                      <a:fillRect/>
+                    </a:stretch>
+                  </pic:blipFill>
+                  <pic:spPr>
+                    <a:xfrm>
+                      <a:off x="0" y="0"/>
+                      <a:ext cx="5943600" cy="4677208"/>
+                    </a:xfrm>
+                    <a:prstGeom prst="rect"/>
+                  </pic:spPr>
+                </pic:pic>
+              </a:graphicData>
+            </a:graphic>
+          </wp:inline>
+        </w:drawing>
+      </w:r>
+    </w:p>
+    <w:p>
+      <w:pPr>
+        <w:spacing w:after="160"/>
+        <w:jc w:val="center"/>
+      </w:pPr>
+      <w:r>
+        <w:rPr>
+          <w:rFonts w:ascii="Hiragino Sans" w:hAnsi="Hiragino Sans" w:eastAsia="Hiragino Sans"/>
+          <w:i/>
+          <w:color w:val="687680"/>
+          <w:sz w:val="17"/>
+        </w:rPr>
+        <w:t>図7　期待するId–Vds表示。VGSごとに複数のcurveが現れ、最大電流は約520 µA。</w:t>
+      </w:r>
+    </w:p>
     <w:p>
       <w:pPr>
         <w:pStyle w:val="Heading2"/>
@@ -9325,6 +9433,17 @@
           <w:rFonts w:ascii="Hiragino Sans" w:hAnsi="Hiragino Sans" w:eastAsia="Hiragino Sans"/>
         </w:rPr>
         <w:t>縦軸のuはµA。800uは800 µA。</w:t>
+      </w:r>
+    </w:p>
+    <w:p>
+      <w:pPr>
+        <w:pStyle w:val="ListBullet"/>
+      </w:pPr>
+      <w:r>
+        <w:rPr>
+          <w:rFonts w:ascii="Hiragino Sans" w:hAnsi="Hiragino Sans" w:eastAsia="Hiragino Sans"/>
+        </w:rPr>
+        <w:t>SPICEの電圧源電流はsourceへ流れ込む向きが正なので、NMOS drain currentを上向きに表示するには i(vd) -1 * とする。Xschemのgraph演算は後置記法（RPN）。</w:t>
       </w:r>
     </w:p>
     <w:p>
@@ -9408,13 +9527,13 @@
     </w:p>
     <w:p>
       <w:pPr>
-        <w:pStyle w:val="Heading1"/>
+        <w:pStyle w:val="Heading2"/>
       </w:pPr>
       <w:r>
         <w:rPr>
           <w:rFonts w:ascii="Hiragino Sans" w:hAnsi="Hiragino Sans" w:eastAsia="Hiragino Sans"/>
         </w:rPr>
-        <w:t>5.3 Netlistとngspiceを追跡する</w:t>
+        <w:t>7.3 Netlistとngspiceを追跡する</w:t>
       </w:r>
     </w:p>
     <w:p>
@@ -9992,7 +10111,7 @@
         <w:rPr>
           <w:rFonts w:ascii="Hiragino Sans" w:hAnsi="Hiragino Sans" w:eastAsia="Hiragino Sans"/>
         </w:rPr>
-        <w:t>5.4 Digital toolの使い分け</w:t>
+        <w:t>8. Digital toolの使い分け</w:t>
       </w:r>
     </w:p>
     <w:tbl>
@@ -12485,7 +12604,7 @@
         <w:drawing>
           <wp:inline xmlns:a="http://schemas.openxmlformats.org/drawingml/2006/main" xmlns:pic="http://schemas.openxmlformats.org/drawingml/2006/picture">
             <wp:extent cx="5897880" cy="3191794"/>
-            <wp:docPr id="7" name="Picture 7"/>
+            <wp:docPr id="8" name="Picture 8"/>
             <wp:cNvGraphicFramePr>
               <a:graphicFrameLocks noChangeAspect="1"/>
             </wp:cNvGraphicFramePr>
@@ -12497,7 +12616,7 @@
                     <pic:cNvPicPr/>
                   </pic:nvPicPr>
                   <pic:blipFill>
-                    <a:blip r:embed="rId17"/>
+                    <a:blip r:embed="rId18"/>
                     <a:stretch>
                       <a:fillRect/>
                     </a:stretch>
@@ -13955,7 +14074,7 @@
         <w:drawing>
           <wp:inline xmlns:a="http://schemas.openxmlformats.org/drawingml/2006/main" xmlns:pic="http://schemas.openxmlformats.org/drawingml/2006/picture">
             <wp:extent cx="5669280" cy="2456688"/>
-            <wp:docPr id="8" name="Picture 8"/>
+            <wp:docPr id="9" name="Picture 9"/>
             <wp:cNvGraphicFramePr>
               <a:graphicFrameLocks noChangeAspect="1"/>
             </wp:cNvGraphicFramePr>
@@ -13967,7 +14086,7 @@
                     <pic:cNvPicPr/>
                   </pic:nvPicPr>
                   <pic:blipFill>
-                    <a:blip r:embed="rId18"/>
+                    <a:blip r:embed="rId19"/>
                     <a:stretch>
                       <a:fillRect/>
                     </a:stretch>
@@ -14118,7 +14237,7 @@
         <w:rPr>
           <w:rFonts w:ascii="Hiragino Sans" w:hAnsi="Hiragino Sans" w:eastAsia="Hiragino Sans"/>
         </w:rPr>
-        <w:t>3. 24-bit serial readout</w:t>
+        <w:t>9. 24-bit serial readout</w:t>
       </w:r>
     </w:p>
     <w:p>
@@ -14657,7 +14776,7 @@
         <w:drawing>
           <wp:inline xmlns:a="http://schemas.openxmlformats.org/drawingml/2006/main" xmlns:pic="http://schemas.openxmlformats.org/drawingml/2006/picture">
             <wp:extent cx="4846320" cy="5248565"/>
-            <wp:docPr id="9" name="Picture 9"/>
+            <wp:docPr id="10" name="Picture 10"/>
             <wp:cNvGraphicFramePr>
               <a:graphicFrameLocks noChangeAspect="1"/>
             </wp:cNvGraphicFramePr>
@@ -14669,7 +14788,7 @@
                     <pic:cNvPicPr/>
                   </pic:nvPicPr>
                   <pic:blipFill>
-                    <a:blip r:embed="rId19"/>
+                    <a:blip r:embed="rId20"/>
                     <a:stretch>
                       <a:fillRect/>
                     </a:stretch>
@@ -15098,7 +15217,7 @@
         <w:rPr>
           <w:rFonts w:ascii="Hiragino Sans" w:hAnsi="Hiragino Sans" w:eastAsia="Hiragino Sans"/>
         </w:rPr>
-        <w:t>4. Signoff結果の読み方</w:t>
+        <w:t>10. Signoff結果の読み方</w:t>
       </w:r>
     </w:p>
     <w:tbl>
@@ -15879,7 +15998,7 @@
         <w:rPr>
           <w:rFonts w:ascii="Hiragino Sans" w:hAnsi="Hiragino Sans" w:eastAsia="Hiragino Sans"/>
         </w:rPr>
-        <w:t>5. 再現可能なデバッグ</w:t>
+        <w:t>11. 再現可能なデバッグ</w:t>
       </w:r>
     </w:p>
     <w:p>
@@ -16365,7 +16484,7 @@
         <w:rPr>
           <w:rFonts w:ascii="Hiragino Sans" w:hAnsi="Hiragino Sans" w:eastAsia="Hiragino Sans"/>
         </w:rPr>
-        <w:t>6. 学生演習</w:t>
+        <w:t>12. 学生演習</w:t>
       </w:r>
     </w:p>
     <w:p>
@@ -16609,7 +16728,7 @@
         <w:rPr>
           <w:rFonts w:ascii="Hiragino Sans" w:hAnsi="Hiragino Sans" w:eastAsia="Hiragino Sans"/>
         </w:rPr>
-        <w:t>7. Prototypeからtape-outへ</w:t>
+        <w:t>13. Prototypeからtape-outへ</w:t>
       </w:r>
     </w:p>
     <w:p>
@@ -17157,7 +17276,7 @@
         <w:rPr>
           <w:rFonts w:ascii="Hiragino Sans" w:hAnsi="Hiragino Sans" w:eastAsia="Hiragino Sans"/>
         </w:rPr>
-        <w:t>8. Specification snapshot</w:t>
+        <w:t>14. Specification snapshot</w:t>
       </w:r>
     </w:p>
     <w:tbl>
@@ -18229,7 +18348,7 @@
         <w:rPr>
           <w:rFonts w:ascii="Hiragino Sans" w:hAnsi="Hiragino Sans" w:eastAsia="Hiragino Sans"/>
         </w:rPr>
-        <w:t>9. Command quick reference</w:t>
+        <w:t>15. Command quick reference</w:t>
       </w:r>
     </w:p>
     <w:tbl>
@@ -19269,7 +19388,7 @@
         <w:rPr>
           <w:rFonts w:ascii="Hiragino Sans" w:hAnsi="Hiragino Sans" w:eastAsia="Hiragino Sans"/>
         </w:rPr>
-        <w:t>10. Final review sheet</w:t>
+        <w:t>16. Final review sheet</w:t>
       </w:r>
     </w:p>
     <w:p>

</xml_diff>

<commit_message>
Restart procedure numbering by section
</commit_message>
<xml_diff>
--- a/docs/lecture/IRSX_ASIC_Student_Lab_Handbook_JP.docx
+++ b/docs/lecture/IRSX_ASIC_Student_Lab_Handbook_JP.docx
@@ -2695,6 +2695,10 @@
     <w:p>
       <w:pPr>
         <w:pStyle w:val="ListNumber"/>
+        <w:numPr>
+          <w:ilvl w:val="0"/>
+          <w:numId w:val="10"/>
+        </w:numPr>
       </w:pPr>
       <w:r>
         <w:rPr>
@@ -2706,6 +2710,10 @@
     <w:p>
       <w:pPr>
         <w:pStyle w:val="ListNumber"/>
+        <w:numPr>
+          <w:ilvl w:val="0"/>
+          <w:numId w:val="10"/>
+        </w:numPr>
       </w:pPr>
       <w:r>
         <w:rPr>
@@ -2717,6 +2725,10 @@
     <w:p>
       <w:pPr>
         <w:pStyle w:val="ListNumber"/>
+        <w:numPr>
+          <w:ilvl w:val="0"/>
+          <w:numId w:val="10"/>
+        </w:numPr>
       </w:pPr>
       <w:r>
         <w:rPr>
@@ -2728,6 +2740,10 @@
     <w:p>
       <w:pPr>
         <w:pStyle w:val="ListNumber"/>
+        <w:numPr>
+          <w:ilvl w:val="0"/>
+          <w:numId w:val="10"/>
+        </w:numPr>
       </w:pPr>
       <w:r>
         <w:rPr>
@@ -2739,6 +2755,10 @@
     <w:p>
       <w:pPr>
         <w:pStyle w:val="ListNumber"/>
+        <w:numPr>
+          <w:ilvl w:val="0"/>
+          <w:numId w:val="10"/>
+        </w:numPr>
       </w:pPr>
       <w:r>
         <w:rPr>
@@ -2750,6 +2770,10 @@
     <w:p>
       <w:pPr>
         <w:pStyle w:val="ListNumber"/>
+        <w:numPr>
+          <w:ilvl w:val="0"/>
+          <w:numId w:val="10"/>
+        </w:numPr>
       </w:pPr>
       <w:r>
         <w:rPr>
@@ -4693,6 +4717,10 @@
     <w:p>
       <w:pPr>
         <w:pStyle w:val="ListNumber"/>
+        <w:numPr>
+          <w:ilvl w:val="0"/>
+          <w:numId w:val="11"/>
+        </w:numPr>
       </w:pPr>
       <w:r>
         <w:rPr>
@@ -4704,6 +4732,10 @@
     <w:p>
       <w:pPr>
         <w:pStyle w:val="ListNumber"/>
+        <w:numPr>
+          <w:ilvl w:val="0"/>
+          <w:numId w:val="11"/>
+        </w:numPr>
       </w:pPr>
       <w:r>
         <w:rPr>
@@ -4715,6 +4747,10 @@
     <w:p>
       <w:pPr>
         <w:pStyle w:val="ListNumber"/>
+        <w:numPr>
+          <w:ilvl w:val="0"/>
+          <w:numId w:val="11"/>
+        </w:numPr>
       </w:pPr>
       <w:r>
         <w:rPr>
@@ -4726,6 +4762,10 @@
     <w:p>
       <w:pPr>
         <w:pStyle w:val="ListNumber"/>
+        <w:numPr>
+          <w:ilvl w:val="0"/>
+          <w:numId w:val="11"/>
+        </w:numPr>
       </w:pPr>
       <w:r>
         <w:rPr>
@@ -4737,6 +4777,10 @@
     <w:p>
       <w:pPr>
         <w:pStyle w:val="ListNumber"/>
+        <w:numPr>
+          <w:ilvl w:val="0"/>
+          <w:numId w:val="11"/>
+        </w:numPr>
       </w:pPr>
       <w:r>
         <w:rPr>
@@ -4748,6 +4792,10 @@
     <w:p>
       <w:pPr>
         <w:pStyle w:val="ListNumber"/>
+        <w:numPr>
+          <w:ilvl w:val="0"/>
+          <w:numId w:val="11"/>
+        </w:numPr>
       </w:pPr>
       <w:r>
         <w:rPr>
@@ -5908,6 +5956,10 @@
     <w:p>
       <w:pPr>
         <w:pStyle w:val="ListNumber"/>
+        <w:numPr>
+          <w:ilvl w:val="0"/>
+          <w:numId w:val="12"/>
+        </w:numPr>
       </w:pPr>
       <w:r>
         <w:rPr>
@@ -5919,6 +5971,10 @@
     <w:p>
       <w:pPr>
         <w:pStyle w:val="ListNumber"/>
+        <w:numPr>
+          <w:ilvl w:val="0"/>
+          <w:numId w:val="12"/>
+        </w:numPr>
       </w:pPr>
       <w:r>
         <w:rPr>
@@ -5930,6 +5986,10 @@
     <w:p>
       <w:pPr>
         <w:pStyle w:val="ListNumber"/>
+        <w:numPr>
+          <w:ilvl w:val="0"/>
+          <w:numId w:val="12"/>
+        </w:numPr>
       </w:pPr>
       <w:r>
         <w:rPr>
@@ -5941,6 +6001,10 @@
     <w:p>
       <w:pPr>
         <w:pStyle w:val="ListNumber"/>
+        <w:numPr>
+          <w:ilvl w:val="0"/>
+          <w:numId w:val="12"/>
+        </w:numPr>
       </w:pPr>
       <w:r>
         <w:rPr>
@@ -5952,6 +6016,10 @@
     <w:p>
       <w:pPr>
         <w:pStyle w:val="ListNumber"/>
+        <w:numPr>
+          <w:ilvl w:val="0"/>
+          <w:numId w:val="12"/>
+        </w:numPr>
       </w:pPr>
       <w:r>
         <w:rPr>
@@ -5963,6 +6031,10 @@
     <w:p>
       <w:pPr>
         <w:pStyle w:val="ListNumber"/>
+        <w:numPr>
+          <w:ilvl w:val="0"/>
+          <w:numId w:val="12"/>
+        </w:numPr>
       </w:pPr>
       <w:r>
         <w:rPr>
@@ -5974,6 +6046,10 @@
     <w:p>
       <w:pPr>
         <w:pStyle w:val="ListNumber"/>
+        <w:numPr>
+          <w:ilvl w:val="0"/>
+          <w:numId w:val="12"/>
+        </w:numPr>
       </w:pPr>
       <w:r>
         <w:rPr>
@@ -5985,6 +6061,10 @@
     <w:p>
       <w:pPr>
         <w:pStyle w:val="ListNumber"/>
+        <w:numPr>
+          <w:ilvl w:val="0"/>
+          <w:numId w:val="12"/>
+        </w:numPr>
       </w:pPr>
       <w:r>
         <w:rPr>
@@ -5996,6 +6076,10 @@
     <w:p>
       <w:pPr>
         <w:pStyle w:val="ListNumber"/>
+        <w:numPr>
+          <w:ilvl w:val="0"/>
+          <w:numId w:val="12"/>
+        </w:numPr>
       </w:pPr>
       <w:r>
         <w:rPr>
@@ -6007,6 +6091,10 @@
     <w:p>
       <w:pPr>
         <w:pStyle w:val="ListNumber"/>
+        <w:numPr>
+          <w:ilvl w:val="0"/>
+          <w:numId w:val="12"/>
+        </w:numPr>
       </w:pPr>
       <w:r>
         <w:rPr>
@@ -7606,6 +7694,10 @@
     <w:p>
       <w:pPr>
         <w:pStyle w:val="ListNumber"/>
+        <w:numPr>
+          <w:ilvl w:val="0"/>
+          <w:numId w:val="13"/>
+        </w:numPr>
       </w:pPr>
       <w:r>
         <w:rPr>
@@ -7617,6 +7709,10 @@
     <w:p>
       <w:pPr>
         <w:pStyle w:val="ListNumber"/>
+        <w:numPr>
+          <w:ilvl w:val="0"/>
+          <w:numId w:val="13"/>
+        </w:numPr>
       </w:pPr>
       <w:r>
         <w:rPr>
@@ -7628,6 +7724,10 @@
     <w:p>
       <w:pPr>
         <w:pStyle w:val="ListNumber"/>
+        <w:numPr>
+          <w:ilvl w:val="0"/>
+          <w:numId w:val="13"/>
+        </w:numPr>
       </w:pPr>
       <w:r>
         <w:rPr>
@@ -7639,6 +7739,10 @@
     <w:p>
       <w:pPr>
         <w:pStyle w:val="ListNumber"/>
+        <w:numPr>
+          <w:ilvl w:val="0"/>
+          <w:numId w:val="13"/>
+        </w:numPr>
       </w:pPr>
       <w:r>
         <w:rPr>
@@ -8555,6 +8659,10 @@
     <w:p>
       <w:pPr>
         <w:pStyle w:val="ListNumber"/>
+        <w:numPr>
+          <w:ilvl w:val="0"/>
+          <w:numId w:val="14"/>
+        </w:numPr>
       </w:pPr>
       <w:r>
         <w:rPr>
@@ -8566,6 +8674,10 @@
     <w:p>
       <w:pPr>
         <w:pStyle w:val="ListNumber"/>
+        <w:numPr>
+          <w:ilvl w:val="0"/>
+          <w:numId w:val="14"/>
+        </w:numPr>
       </w:pPr>
       <w:r>
         <w:rPr>
@@ -8577,6 +8689,10 @@
     <w:p>
       <w:pPr>
         <w:pStyle w:val="ListNumber"/>
+        <w:numPr>
+          <w:ilvl w:val="0"/>
+          <w:numId w:val="14"/>
+        </w:numPr>
       </w:pPr>
       <w:r>
         <w:rPr>
@@ -8588,6 +8704,10 @@
     <w:p>
       <w:pPr>
         <w:pStyle w:val="ListNumber"/>
+        <w:numPr>
+          <w:ilvl w:val="0"/>
+          <w:numId w:val="14"/>
+        </w:numPr>
       </w:pPr>
       <w:r>
         <w:rPr>
@@ -8599,6 +8719,10 @@
     <w:p>
       <w:pPr>
         <w:pStyle w:val="ListNumber"/>
+        <w:numPr>
+          <w:ilvl w:val="0"/>
+          <w:numId w:val="14"/>
+        </w:numPr>
       </w:pPr>
       <w:r>
         <w:rPr>
@@ -9198,6 +9322,10 @@
     <w:p>
       <w:pPr>
         <w:pStyle w:val="ListNumber"/>
+        <w:numPr>
+          <w:ilvl w:val="0"/>
+          <w:numId w:val="15"/>
+        </w:numPr>
       </w:pPr>
       <w:r>
         <w:rPr>
@@ -9209,6 +9337,10 @@
     <w:p>
       <w:pPr>
         <w:pStyle w:val="ListNumber"/>
+        <w:numPr>
+          <w:ilvl w:val="0"/>
+          <w:numId w:val="15"/>
+        </w:numPr>
       </w:pPr>
       <w:r>
         <w:rPr>
@@ -9220,6 +9352,10 @@
     <w:p>
       <w:pPr>
         <w:pStyle w:val="ListNumber"/>
+        <w:numPr>
+          <w:ilvl w:val="0"/>
+          <w:numId w:val="15"/>
+        </w:numPr>
       </w:pPr>
       <w:r>
         <w:rPr>
@@ -9231,6 +9367,10 @@
     <w:p>
       <w:pPr>
         <w:pStyle w:val="ListNumber"/>
+        <w:numPr>
+          <w:ilvl w:val="0"/>
+          <w:numId w:val="15"/>
+        </w:numPr>
       </w:pPr>
       <w:r>
         <w:rPr>
@@ -9242,6 +9382,10 @@
     <w:p>
       <w:pPr>
         <w:pStyle w:val="ListNumber"/>
+        <w:numPr>
+          <w:ilvl w:val="0"/>
+          <w:numId w:val="15"/>
+        </w:numPr>
       </w:pPr>
       <w:r>
         <w:rPr>
@@ -9253,6 +9397,10 @@
     <w:p>
       <w:pPr>
         <w:pStyle w:val="ListNumber"/>
+        <w:numPr>
+          <w:ilvl w:val="0"/>
+          <w:numId w:val="15"/>
+        </w:numPr>
       </w:pPr>
       <w:r>
         <w:rPr>
@@ -9994,6 +10142,10 @@
     <w:p>
       <w:pPr>
         <w:pStyle w:val="ListNumber"/>
+        <w:numPr>
+          <w:ilvl w:val="0"/>
+          <w:numId w:val="16"/>
+        </w:numPr>
       </w:pPr>
       <w:r>
         <w:rPr>
@@ -10005,6 +10157,10 @@
     <w:p>
       <w:pPr>
         <w:pStyle w:val="ListNumber"/>
+        <w:numPr>
+          <w:ilvl w:val="0"/>
+          <w:numId w:val="16"/>
+        </w:numPr>
       </w:pPr>
       <w:r>
         <w:rPr>
@@ -10016,6 +10172,10 @@
     <w:p>
       <w:pPr>
         <w:pStyle w:val="ListNumber"/>
+        <w:numPr>
+          <w:ilvl w:val="0"/>
+          <w:numId w:val="16"/>
+        </w:numPr>
       </w:pPr>
       <w:r>
         <w:rPr>
@@ -10027,6 +10187,10 @@
     <w:p>
       <w:pPr>
         <w:pStyle w:val="ListNumber"/>
+        <w:numPr>
+          <w:ilvl w:val="0"/>
+          <w:numId w:val="16"/>
+        </w:numPr>
       </w:pPr>
       <w:r>
         <w:rPr>
@@ -10038,6 +10202,10 @@
     <w:p>
       <w:pPr>
         <w:pStyle w:val="ListNumber"/>
+        <w:numPr>
+          <w:ilvl w:val="0"/>
+          <w:numId w:val="16"/>
+        </w:numPr>
       </w:pPr>
       <w:r>
         <w:rPr>
@@ -10668,6 +10836,10 @@
     <w:p>
       <w:pPr>
         <w:pStyle w:val="ListNumber"/>
+        <w:numPr>
+          <w:ilvl w:val="0"/>
+          <w:numId w:val="17"/>
+        </w:numPr>
       </w:pPr>
       <w:r>
         <w:rPr>
@@ -10679,6 +10851,10 @@
     <w:p>
       <w:pPr>
         <w:pStyle w:val="ListNumber"/>
+        <w:numPr>
+          <w:ilvl w:val="0"/>
+          <w:numId w:val="17"/>
+        </w:numPr>
       </w:pPr>
       <w:r>
         <w:rPr>
@@ -10690,6 +10866,10 @@
     <w:p>
       <w:pPr>
         <w:pStyle w:val="ListNumber"/>
+        <w:numPr>
+          <w:ilvl w:val="0"/>
+          <w:numId w:val="17"/>
+        </w:numPr>
       </w:pPr>
       <w:r>
         <w:rPr>
@@ -10701,6 +10881,10 @@
     <w:p>
       <w:pPr>
         <w:pStyle w:val="ListNumber"/>
+        <w:numPr>
+          <w:ilvl w:val="0"/>
+          <w:numId w:val="17"/>
+        </w:numPr>
       </w:pPr>
       <w:r>
         <w:rPr>
@@ -10712,6 +10896,10 @@
     <w:p>
       <w:pPr>
         <w:pStyle w:val="ListNumber"/>
+        <w:numPr>
+          <w:ilvl w:val="0"/>
+          <w:numId w:val="17"/>
+        </w:numPr>
       </w:pPr>
       <w:r>
         <w:rPr>
@@ -10821,6 +11009,10 @@
     <w:p>
       <w:pPr>
         <w:pStyle w:val="ListNumber"/>
+        <w:numPr>
+          <w:ilvl w:val="0"/>
+          <w:numId w:val="18"/>
+        </w:numPr>
       </w:pPr>
       <w:r>
         <w:rPr>
@@ -10832,6 +11024,10 @@
     <w:p>
       <w:pPr>
         <w:pStyle w:val="ListNumber"/>
+        <w:numPr>
+          <w:ilvl w:val="0"/>
+          <w:numId w:val="18"/>
+        </w:numPr>
       </w:pPr>
       <w:r>
         <w:rPr>
@@ -10843,6 +11039,10 @@
     <w:p>
       <w:pPr>
         <w:pStyle w:val="ListNumber"/>
+        <w:numPr>
+          <w:ilvl w:val="0"/>
+          <w:numId w:val="18"/>
+        </w:numPr>
       </w:pPr>
       <w:r>
         <w:rPr>
@@ -10854,6 +11054,10 @@
     <w:p>
       <w:pPr>
         <w:pStyle w:val="ListNumber"/>
+        <w:numPr>
+          <w:ilvl w:val="0"/>
+          <w:numId w:val="18"/>
+        </w:numPr>
       </w:pPr>
       <w:r>
         <w:rPr>
@@ -11062,6 +11266,10 @@
     <w:p>
       <w:pPr>
         <w:pStyle w:val="ListNumber"/>
+        <w:numPr>
+          <w:ilvl w:val="0"/>
+          <w:numId w:val="19"/>
+        </w:numPr>
       </w:pPr>
       <w:r>
         <w:rPr>
@@ -11073,6 +11281,10 @@
     <w:p>
       <w:pPr>
         <w:pStyle w:val="ListNumber"/>
+        <w:numPr>
+          <w:ilvl w:val="0"/>
+          <w:numId w:val="19"/>
+        </w:numPr>
       </w:pPr>
       <w:r>
         <w:rPr>
@@ -11084,6 +11296,10 @@
     <w:p>
       <w:pPr>
         <w:pStyle w:val="ListNumber"/>
+        <w:numPr>
+          <w:ilvl w:val="0"/>
+          <w:numId w:val="19"/>
+        </w:numPr>
       </w:pPr>
       <w:r>
         <w:rPr>
@@ -11095,6 +11311,10 @@
     <w:p>
       <w:pPr>
         <w:pStyle w:val="ListNumber"/>
+        <w:numPr>
+          <w:ilvl w:val="0"/>
+          <w:numId w:val="19"/>
+        </w:numPr>
       </w:pPr>
       <w:r>
         <w:rPr>
@@ -11106,6 +11326,10 @@
     <w:p>
       <w:pPr>
         <w:pStyle w:val="ListNumber"/>
+        <w:numPr>
+          <w:ilvl w:val="0"/>
+          <w:numId w:val="19"/>
+        </w:numPr>
       </w:pPr>
       <w:r>
         <w:rPr>
@@ -12368,6 +12592,10 @@
     <w:p>
       <w:pPr>
         <w:pStyle w:val="ListNumber"/>
+        <w:numPr>
+          <w:ilvl w:val="0"/>
+          <w:numId w:val="20"/>
+        </w:numPr>
       </w:pPr>
       <w:r>
         <w:rPr>
@@ -12379,6 +12607,10 @@
     <w:p>
       <w:pPr>
         <w:pStyle w:val="ListNumber"/>
+        <w:numPr>
+          <w:ilvl w:val="0"/>
+          <w:numId w:val="20"/>
+        </w:numPr>
       </w:pPr>
       <w:r>
         <w:rPr>
@@ -12390,6 +12622,10 @@
     <w:p>
       <w:pPr>
         <w:pStyle w:val="ListNumber"/>
+        <w:numPr>
+          <w:ilvl w:val="0"/>
+          <w:numId w:val="20"/>
+        </w:numPr>
       </w:pPr>
       <w:r>
         <w:rPr>
@@ -12401,6 +12637,10 @@
     <w:p>
       <w:pPr>
         <w:pStyle w:val="ListNumber"/>
+        <w:numPr>
+          <w:ilvl w:val="0"/>
+          <w:numId w:val="20"/>
+        </w:numPr>
       </w:pPr>
       <w:r>
         <w:rPr>
@@ -12412,6 +12652,10 @@
     <w:p>
       <w:pPr>
         <w:pStyle w:val="ListNumber"/>
+        <w:numPr>
+          <w:ilvl w:val="0"/>
+          <w:numId w:val="20"/>
+        </w:numPr>
       </w:pPr>
       <w:r>
         <w:rPr>
@@ -13319,6 +13563,10 @@
     <w:p>
       <w:pPr>
         <w:pStyle w:val="ListNumber"/>
+        <w:numPr>
+          <w:ilvl w:val="0"/>
+          <w:numId w:val="21"/>
+        </w:numPr>
       </w:pPr>
       <w:r>
         <w:rPr>
@@ -13330,6 +13578,10 @@
     <w:p>
       <w:pPr>
         <w:pStyle w:val="ListNumber"/>
+        <w:numPr>
+          <w:ilvl w:val="0"/>
+          <w:numId w:val="21"/>
+        </w:numPr>
       </w:pPr>
       <w:r>
         <w:rPr>
@@ -13341,6 +13593,10 @@
     <w:p>
       <w:pPr>
         <w:pStyle w:val="ListNumber"/>
+        <w:numPr>
+          <w:ilvl w:val="0"/>
+          <w:numId w:val="21"/>
+        </w:numPr>
       </w:pPr>
       <w:r>
         <w:rPr>
@@ -13352,6 +13608,10 @@
     <w:p>
       <w:pPr>
         <w:pStyle w:val="ListNumber"/>
+        <w:numPr>
+          <w:ilvl w:val="0"/>
+          <w:numId w:val="21"/>
+        </w:numPr>
       </w:pPr>
       <w:r>
         <w:rPr>
@@ -13363,6 +13623,10 @@
     <w:p>
       <w:pPr>
         <w:pStyle w:val="ListNumber"/>
+        <w:numPr>
+          <w:ilvl w:val="0"/>
+          <w:numId w:val="21"/>
+        </w:numPr>
       </w:pPr>
       <w:r>
         <w:rPr>
@@ -13374,6 +13638,10 @@
     <w:p>
       <w:pPr>
         <w:pStyle w:val="ListNumber"/>
+        <w:numPr>
+          <w:ilvl w:val="0"/>
+          <w:numId w:val="21"/>
+        </w:numPr>
       </w:pPr>
       <w:r>
         <w:rPr>
@@ -13930,6 +14198,10 @@
     <w:p>
       <w:pPr>
         <w:pStyle w:val="ListNumber"/>
+        <w:numPr>
+          <w:ilvl w:val="0"/>
+          <w:numId w:val="22"/>
+        </w:numPr>
       </w:pPr>
       <w:r>
         <w:rPr>
@@ -13941,6 +14213,10 @@
     <w:p>
       <w:pPr>
         <w:pStyle w:val="ListNumber"/>
+        <w:numPr>
+          <w:ilvl w:val="0"/>
+          <w:numId w:val="22"/>
+        </w:numPr>
       </w:pPr>
       <w:r>
         <w:rPr>
@@ -13952,6 +14228,10 @@
     <w:p>
       <w:pPr>
         <w:pStyle w:val="ListNumber"/>
+        <w:numPr>
+          <w:ilvl w:val="0"/>
+          <w:numId w:val="22"/>
+        </w:numPr>
       </w:pPr>
       <w:r>
         <w:rPr>
@@ -13963,6 +14243,10 @@
     <w:p>
       <w:pPr>
         <w:pStyle w:val="ListNumber"/>
+        <w:numPr>
+          <w:ilvl w:val="0"/>
+          <w:numId w:val="22"/>
+        </w:numPr>
       </w:pPr>
       <w:r>
         <w:rPr>
@@ -13974,6 +14258,10 @@
     <w:p>
       <w:pPr>
         <w:pStyle w:val="ListNumber"/>
+        <w:numPr>
+          <w:ilvl w:val="0"/>
+          <w:numId w:val="22"/>
+        </w:numPr>
       </w:pPr>
       <w:r>
         <w:rPr>
@@ -14594,6 +14882,10 @@
     <w:p>
       <w:pPr>
         <w:pStyle w:val="ListNumber"/>
+        <w:numPr>
+          <w:ilvl w:val="0"/>
+          <w:numId w:val="23"/>
+        </w:numPr>
       </w:pPr>
       <w:r>
         <w:rPr>
@@ -14605,6 +14897,10 @@
     <w:p>
       <w:pPr>
         <w:pStyle w:val="ListNumber"/>
+        <w:numPr>
+          <w:ilvl w:val="0"/>
+          <w:numId w:val="23"/>
+        </w:numPr>
       </w:pPr>
       <w:r>
         <w:rPr>
@@ -14616,6 +14912,10 @@
     <w:p>
       <w:pPr>
         <w:pStyle w:val="ListNumber"/>
+        <w:numPr>
+          <w:ilvl w:val="0"/>
+          <w:numId w:val="23"/>
+        </w:numPr>
       </w:pPr>
       <w:r>
         <w:rPr>
@@ -14627,6 +14927,10 @@
     <w:p>
       <w:pPr>
         <w:pStyle w:val="ListNumber"/>
+        <w:numPr>
+          <w:ilvl w:val="0"/>
+          <w:numId w:val="23"/>
+        </w:numPr>
       </w:pPr>
       <w:r>
         <w:rPr>
@@ -16023,6 +16327,10 @@
     <w:p>
       <w:pPr>
         <w:pStyle w:val="ListNumber"/>
+        <w:numPr>
+          <w:ilvl w:val="0"/>
+          <w:numId w:val="24"/>
+        </w:numPr>
       </w:pPr>
       <w:r>
         <w:rPr>
@@ -16034,6 +16342,10 @@
     <w:p>
       <w:pPr>
         <w:pStyle w:val="ListNumber"/>
+        <w:numPr>
+          <w:ilvl w:val="0"/>
+          <w:numId w:val="24"/>
+        </w:numPr>
       </w:pPr>
       <w:r>
         <w:rPr>
@@ -16045,6 +16357,10 @@
     <w:p>
       <w:pPr>
         <w:pStyle w:val="ListNumber"/>
+        <w:numPr>
+          <w:ilvl w:val="0"/>
+          <w:numId w:val="24"/>
+        </w:numPr>
       </w:pPr>
       <w:r>
         <w:rPr>
@@ -16056,6 +16372,10 @@
     <w:p>
       <w:pPr>
         <w:pStyle w:val="ListNumber"/>
+        <w:numPr>
+          <w:ilvl w:val="0"/>
+          <w:numId w:val="24"/>
+        </w:numPr>
       </w:pPr>
       <w:r>
         <w:rPr>
@@ -16067,6 +16387,10 @@
     <w:p>
       <w:pPr>
         <w:pStyle w:val="ListNumber"/>
+        <w:numPr>
+          <w:ilvl w:val="0"/>
+          <w:numId w:val="24"/>
+        </w:numPr>
       </w:pPr>
       <w:r>
         <w:rPr>
@@ -16078,6 +16402,10 @@
     <w:p>
       <w:pPr>
         <w:pStyle w:val="ListNumber"/>
+        <w:numPr>
+          <w:ilvl w:val="0"/>
+          <w:numId w:val="24"/>
+        </w:numPr>
       </w:pPr>
       <w:r>
         <w:rPr>
@@ -16089,6 +16417,10 @@
     <w:p>
       <w:pPr>
         <w:pStyle w:val="ListNumber"/>
+        <w:numPr>
+          <w:ilvl w:val="0"/>
+          <w:numId w:val="24"/>
+        </w:numPr>
       </w:pPr>
       <w:r>
         <w:rPr>
@@ -19833,6 +20165,96 @@
   </w:num>
   <w:num w:numId="9">
     <w:abstractNumId w:val="0"/>
+  </w:num>
+  <w:num w:numId="10">
+    <w:abstractNumId w:val="7"/>
+    <w:lvlOverride w:ilvl="0">
+      <w:startOverride w:val="1"/>
+    </w:lvlOverride>
+  </w:num>
+  <w:num w:numId="11">
+    <w:abstractNumId w:val="7"/>
+    <w:lvlOverride w:ilvl="0">
+      <w:startOverride w:val="1"/>
+    </w:lvlOverride>
+  </w:num>
+  <w:num w:numId="12">
+    <w:abstractNumId w:val="7"/>
+    <w:lvlOverride w:ilvl="0">
+      <w:startOverride w:val="1"/>
+    </w:lvlOverride>
+  </w:num>
+  <w:num w:numId="13">
+    <w:abstractNumId w:val="7"/>
+    <w:lvlOverride w:ilvl="0">
+      <w:startOverride w:val="1"/>
+    </w:lvlOverride>
+  </w:num>
+  <w:num w:numId="14">
+    <w:abstractNumId w:val="7"/>
+    <w:lvlOverride w:ilvl="0">
+      <w:startOverride w:val="1"/>
+    </w:lvlOverride>
+  </w:num>
+  <w:num w:numId="15">
+    <w:abstractNumId w:val="7"/>
+    <w:lvlOverride w:ilvl="0">
+      <w:startOverride w:val="1"/>
+    </w:lvlOverride>
+  </w:num>
+  <w:num w:numId="16">
+    <w:abstractNumId w:val="7"/>
+    <w:lvlOverride w:ilvl="0">
+      <w:startOverride w:val="1"/>
+    </w:lvlOverride>
+  </w:num>
+  <w:num w:numId="17">
+    <w:abstractNumId w:val="7"/>
+    <w:lvlOverride w:ilvl="0">
+      <w:startOverride w:val="1"/>
+    </w:lvlOverride>
+  </w:num>
+  <w:num w:numId="18">
+    <w:abstractNumId w:val="7"/>
+    <w:lvlOverride w:ilvl="0">
+      <w:startOverride w:val="1"/>
+    </w:lvlOverride>
+  </w:num>
+  <w:num w:numId="19">
+    <w:abstractNumId w:val="7"/>
+    <w:lvlOverride w:ilvl="0">
+      <w:startOverride w:val="1"/>
+    </w:lvlOverride>
+  </w:num>
+  <w:num w:numId="20">
+    <w:abstractNumId w:val="7"/>
+    <w:lvlOverride w:ilvl="0">
+      <w:startOverride w:val="1"/>
+    </w:lvlOverride>
+  </w:num>
+  <w:num w:numId="21">
+    <w:abstractNumId w:val="7"/>
+    <w:lvlOverride w:ilvl="0">
+      <w:startOverride w:val="1"/>
+    </w:lvlOverride>
+  </w:num>
+  <w:num w:numId="22">
+    <w:abstractNumId w:val="7"/>
+    <w:lvlOverride w:ilvl="0">
+      <w:startOverride w:val="1"/>
+    </w:lvlOverride>
+  </w:num>
+  <w:num w:numId="23">
+    <w:abstractNumId w:val="7"/>
+    <w:lvlOverride w:ilvl="0">
+      <w:startOverride w:val="1"/>
+    </w:lvlOverride>
+  </w:num>
+  <w:num w:numId="24">
+    <w:abstractNumId w:val="7"/>
+    <w:lvlOverride w:ilvl="0">
+      <w:startOverride w:val="1"/>
+    </w:lvlOverride>
   </w:num>
 </w:numbering>
 </file>

</xml_diff>

<commit_message>
fix handbook diagrams and figure numbering
</commit_message>
<xml_diff>
--- a/docs/lecture/IRSX_ASIC_Student_Lab_Handbook_JP.docx
+++ b/docs/lecture/IRSX_ASIC_Student_Lab_Handbook_JP.docx
@@ -93,12 +93,6 @@
         <w:jc w:val="center"/>
       </w:pPr>
       <w:r>
-        <w:rPr>
-          <w:rFonts w:ascii="Hiragino Sans" w:hAnsi="Hiragino Sans" w:eastAsia="Hiragino Sans"/>
-          <w:i/>
-          <w:color w:val="687680"/>
-          <w:sz w:val="17"/>
-        </w:rPr>
         <w:t>図1　本プロトタイプの信号経路。青はアナログ、緑はデジタル領域。</w:t>
       </w:r>
     </w:p>
@@ -1739,13 +1733,7 @@
         <w:jc w:val="center"/>
       </w:pPr>
       <w:r>
-        <w:rPr>
-          <w:rFonts w:ascii="Hiragino Sans" w:hAnsi="Hiragino Sans" w:eastAsia="Hiragino Sans"/>
-          <w:i/>
-          <w:color w:val="687680"/>
-          <w:sz w:val="17"/>
-        </w:rPr>
-        <w:t>図3　各toolの入力と出力。Makefileはこの連鎖を短いcommandで実行する。</w:t>
+        <w:t>図2　各toolの入力と出力。Makefileはこの連鎖を短いcommandで実行する。</w:t>
       </w:r>
     </w:p>
     <w:tbl>
@@ -3303,13 +3291,7 @@
         <w:jc w:val="center"/>
       </w:pPr>
       <w:r>
-        <w:rPr>
-          <w:rFonts w:ascii="Hiragino Sans" w:hAnsi="Hiragino Sans" w:eastAsia="Hiragino Sans"/>
-          <w:i/>
-          <w:color w:val="687680"/>
-          <w:sz w:val="17"/>
-        </w:rPr>
-        <w:t>図4　deviceのbiasからsampling誤差までを一つの因果関係として考える。</w:t>
+        <w:t>図3　deviceのbiasからsampling誤差までを一つの因果関係として考える。</w:t>
       </w:r>
     </w:p>
     <w:p>
@@ -4922,13 +4904,7 @@
         <w:jc w:val="center"/>
       </w:pPr>
       <w:r>
-        <w:rPr>
-          <w:rFonts w:ascii="Hiragino Sans" w:hAnsi="Hiragino Sans" w:eastAsia="Hiragino Sans"/>
-          <w:i/>
-          <w:color w:val="687680"/>
-          <w:sz w:val="17"/>
-        </w:rPr>
-        <w:t>図5　信号名付きmodule接続。controllerが時間順序を作り、analog crossingをGray captureがcodeへ変える。</w:t>
+        <w:t>図4　信号名付きmodule接続。controllerが時間順序を作り、analog crossingをGray captureがcodeへ変える。</w:t>
       </w:r>
     </w:p>
     <w:tbl>
@@ -6550,13 +6526,7 @@
         <w:jc w:val="center"/>
       </w:pPr>
       <w:r>
-        <w:rPr>
-          <w:rFonts w:ascii="Hiragino Sans" w:hAnsi="Hiragino Sans" w:eastAsia="Hiragino Sans"/>
-          <w:i/>
-          <w:color w:val="687680"/>
-          <w:sz w:val="17"/>
-        </w:rPr>
-        <w:t>図2　仕様からGDSIIまで。各矢印が検証可能であることがcomplete flowの条件。</w:t>
+        <w:t>図5　仕様からGDSIIまで。各矢印が検証可能であることがcomplete flowの条件。</w:t>
       </w:r>
     </w:p>
     <w:p>
@@ -8959,12 +8929,6 @@
         <w:jc w:val="center"/>
       </w:pPr>
       <w:r>
-        <w:rPr>
-          <w:rFonts w:ascii="Hiragino Sans" w:hAnsi="Hiragino Sans" w:eastAsia="Hiragino Sans"/>
-          <w:i/>
-          <w:color w:val="687680"/>
-          <w:sz w:val="17"/>
-        </w:rPr>
         <w:t>図6　nmos_dc.schを開いた直後。右のgraphが空なのはRAW結果をまだ読み込んでいないため。</w:t>
       </w:r>
     </w:p>
@@ -9530,12 +9494,6 @@
         <w:jc w:val="center"/>
       </w:pPr>
       <w:r>
-        <w:rPr>
-          <w:rFonts w:ascii="Hiragino Sans" w:hAnsi="Hiragino Sans" w:eastAsia="Hiragino Sans"/>
-          <w:i/>
-          <w:color w:val="687680"/>
-          <w:sz w:val="17"/>
-        </w:rPr>
         <w:t>図7　期待するId–Vds表示。VGSごとに複数のcurveが現れ、最大電流は約520 µA。</w:t>
       </w:r>
     </w:p>
@@ -12885,13 +12843,7 @@
         <w:jc w:val="center"/>
       </w:pPr>
       <w:r>
-        <w:rPr>
-          <w:rFonts w:ascii="Hiragino Sans" w:hAnsi="Hiragino Sans" w:eastAsia="Hiragino Sans"/>
-          <w:i/>
-          <w:color w:val="687680"/>
-          <w:sz w:val="17"/>
-        </w:rPr>
-        <w:t>図3　4-cell shared Wilkinson conversion。上段は保持値とMUX bus、下段はrampとcomparator。</w:t>
+        <w:t>図8　4-cell shared Wilkinson conversion。上段は保持値とMUX bus、下段はrampとcomparator。</w:t>
       </w:r>
     </w:p>
     <w:tbl>
@@ -13570,7 +13522,7 @@
     </w:p>
     <w:p>
       <w:r>
-        <w:t>図4　GAWによる4-cell統合SPICE波形。上段は入力と4つの保持電圧、中段はMUX busとramp、下段はresetとcomparator出力。画像は約7 µsまでなので、4 cellすべてを見るときはZ Outで約11.6 µsまで表示する。</w:t>
+        <w:t>図9　GAWによる4-cell統合SPICE波形。上段は入力と4つの保持電圧、中段はMUX busとramp、下段はresetとcomparator出力。画像は約7 µsまでなので、4 cellすべてを見るときはZ Outで約11.6 µsまで表示する。</w:t>
       </w:r>
     </w:p>
     <w:p>
@@ -14553,13 +14505,7 @@
         <w:jc w:val="center"/>
       </w:pPr>
       <w:r>
-        <w:rPr>
-          <w:rFonts w:ascii="Hiragino Sans" w:hAnsi="Hiragino Sans" w:eastAsia="Hiragino Sans"/>
-          <w:i/>
-          <w:color w:val="687680"/>
-          <w:sz w:val="17"/>
-        </w:rPr>
-        <w:t>図4　cell 2のphase sweep。+500 ps付近でcodeが27から28へ変わる。</w:t>
+        <w:t>図10　cell 2のphase sweep。+500 ps付近でcodeが27から28へ変わる。</w:t>
       </w:r>
     </w:p>
     <w:p>
@@ -15271,13 +15217,7 @@
         <w:jc w:val="center"/>
       </w:pPr>
       <w:r>
-        <w:rPr>
-          <w:rFonts w:ascii="Hiragino Sans" w:hAnsi="Hiragino Sans" w:eastAsia="Hiragino Sans"/>
-          <w:i/>
-          <w:color w:val="687680"/>
-          <w:sz w:val="17"/>
-        </w:rPr>
-        <w:t>図5　GF180 standard-cell flowで生成したデジタルtopの最終レイアウト。</w:t>
+        <w:t>図11　GF180 standard-cell flowで生成したデジタルtopの最終レイアウト。</w:t>
       </w:r>
     </w:p>
     <w:tbl>

</xml_diff>